<commit_message>
Add concept document for person/order/service, update data model runbook
Co-Authored-By: Claude Sonnet 5 <noreply@anthropic.com>
</commit_message>
<xml_diff>
--- a/docs/runbook_umstellung_datenmodell.docx
+++ b/docs/runbook_umstellung_datenmodell.docx
@@ -2,7 +2,7 @@
 <file path=word/document.xml><?xml version="1.0" encoding="utf-8"?>
 <w:document xmlns:w="http://schemas.openxmlformats.org/wordprocessingml/2006/main" xmlns:m="http://schemas.openxmlformats.org/officeDocument/2006/math" xmlns:r="http://schemas.openxmlformats.org/officeDocument/2006/relationships" xmlns:o="urn:schemas-microsoft-com:office:office" xmlns:v="urn:schemas-microsoft-com:vml" xmlns:w10="urn:schemas-microsoft-com:office:word" xmlns:a="http://schemas.openxmlformats.org/drawingml/2006/main" xmlns:pic="http://schemas.openxmlformats.org/drawingml/2006/picture" xmlns:wp="http://schemas.openxmlformats.org/drawingml/2006/wordprocessingDrawing">
   <w:body>
-    <w:bookmarkStart w:id="28" w:name="X252f31a3cd1c52806cc27230c7fbb84f45ebfcc"/>
+    <w:bookmarkStart w:id="29" w:name="X252f31a3cd1c52806cc27230c7fbb84f45ebfcc"/>
     <w:p>
       <w:pPr>
         <w:pStyle w:val="Heading1"/>
@@ -595,7 +595,7 @@
       </w:r>
     </w:p>
     <w:bookmarkEnd w:id="24"/>
-    <w:bookmarkStart w:id="26" w:name="bei-einem-ereignis-zu-pflegen"/>
+    <w:bookmarkStart w:id="27" w:name="bei-einem-ereignis-zu-pflegen"/>
     <w:p>
       <w:pPr>
         <w:pStyle w:val="Heading2"/>
@@ -1467,13 +1467,51 @@
         <w:t xml:space="preserve">entfernen, sonst entsteht ein Bogen ohne Stunden.</w:t>
       </w:r>
     </w:p>
-    <w:bookmarkStart w:id="25" w:name="regeln-die-man-sich-merken-muss"/>
+    <w:bookmarkStart w:id="25" w:name="typische-vorgänge"/>
     <w:p>
       <w:pPr>
         <w:pStyle w:val="Heading3"/>
       </w:pPr>
       <w:r>
-        <w:t xml:space="preserve">Regeln, die man sich merken muss</w:t>
+        <w:t xml:space="preserve">Typische Vorgänge</w:t>
+      </w:r>
+    </w:p>
+    <w:p>
+      <w:pPr>
+        <w:pStyle w:val="FirstParagraph"/>
+      </w:pPr>
+      <w:r>
+        <w:t xml:space="preserve">Die Tabelle oben sagt, welche Blätter betroffen sind. Hier stehen die Schritte in der</w:t>
+      </w:r>
+      <w:r>
+        <w:t xml:space="preserve"> </w:t>
+      </w:r>
+      <w:r>
+        <w:t xml:space="preserve">Reihenfolge, in der man sie ausführt. Nach jedem Vorgang kurz ins Blatt «Prüfungen» oder in</w:t>
+      </w:r>
+      <w:r>
+        <w:t xml:space="preserve"> </w:t>
+      </w:r>
+      <w:r>
+        <w:t xml:space="preserve">die «Fehlerliste» schauen.</w:t>
+      </w:r>
+    </w:p>
+    <w:p>
+      <w:pPr>
+        <w:pStyle w:val="BodyText"/>
+      </w:pPr>
+      <w:r>
+        <w:rPr>
+          <w:b/>
+          <w:bCs/>
+        </w:rPr>
+        <w:t xml:space="preserve">Neues Kind anlegen</w:t>
+      </w:r>
+      <w:r>
+        <w:t xml:space="preserve"> </w:t>
+      </w:r>
+      <w:r>
+        <w:t xml:space="preserve">(Blatt «Kinder»)</w:t>
       </w:r>
     </w:p>
     <w:p>
@@ -1485,6 +1523,492 @@
         </w:numPr>
       </w:pPr>
       <w:r>
+        <w:t xml:space="preserve">Nächste freie Kind-Nr eintragen (C und vier Ziffern).</w:t>
+      </w:r>
+    </w:p>
+    <w:p>
+      <w:pPr>
+        <w:pStyle w:val="Compact"/>
+        <w:numPr>
+          <w:ilvl w:val="0"/>
+          <w:numId w:val="1002"/>
+        </w:numPr>
+      </w:pPr>
+      <w:r>
+        <w:t xml:space="preserve">Name, Geburtsdatum, Geschlecht, UMA/UMF, Wohnkanton, Sprache und AHV-Nummer erfassen.</w:t>
+      </w:r>
+      <w:r>
+        <w:t xml:space="preserve"> </w:t>
+      </w:r>
+      <w:r>
+        <w:t xml:space="preserve">Für Accordix sind Geburtsdatum, Geschlecht, UMA/UMF und Wohnkanton Pflicht.</w:t>
+      </w:r>
+    </w:p>
+    <w:p>
+      <w:pPr>
+        <w:pStyle w:val="Compact"/>
+        <w:numPr>
+          <w:ilvl w:val="0"/>
+          <w:numId w:val="1002"/>
+        </w:numPr>
+      </w:pPr>
+      <w:r>
+        <w:t xml:space="preserve">Kurzzeichen bilden: zwei Buchstaben vom Vornamen, zwei vom Nachnamen (MaSt). Ist es schon</w:t>
+      </w:r>
+      <w:r>
+        <w:t xml:space="preserve"> </w:t>
+      </w:r>
+      <w:r>
+        <w:t xml:space="preserve">vergeben, eine Ziffer anhängen (MaSt2).</w:t>
+      </w:r>
+    </w:p>
+    <w:p>
+      <w:pPr>
+        <w:pStyle w:val="Compact"/>
+        <w:numPr>
+          <w:ilvl w:val="0"/>
+          <w:numId w:val="1002"/>
+        </w:numPr>
+      </w:pPr>
+      <w:r>
+        <w:t xml:space="preserve">«Familie» nur bei Geschwistern füllen, mit demselben Text wie beim Geschwisterkind.</w:t>
+      </w:r>
+    </w:p>
+    <w:p>
+      <w:pPr>
+        <w:pStyle w:val="Compact"/>
+        <w:numPr>
+          <w:ilvl w:val="0"/>
+          <w:numId w:val="1002"/>
+        </w:numPr>
+      </w:pPr>
+      <w:r>
+        <w:t xml:space="preserve">Solange das Kind keinen Auftrag hat, meldet die Prüfung «Kind ohne jede Betreuung». Das ist</w:t>
+      </w:r>
+      <w:r>
+        <w:t xml:space="preserve"> </w:t>
+      </w:r>
+      <w:r>
+        <w:t xml:space="preserve">normal und verschwindet mit dem nächsten Schritt.</w:t>
+      </w:r>
+    </w:p>
+    <w:p>
+      <w:pPr>
+        <w:pStyle w:val="FirstParagraph"/>
+      </w:pPr>
+      <w:r>
+        <w:rPr>
+          <w:b/>
+          <w:bCs/>
+        </w:rPr>
+        <w:t xml:space="preserve">Neuen Auftrag anlegen</w:t>
+      </w:r>
+    </w:p>
+    <w:p>
+      <w:pPr>
+        <w:pStyle w:val="Compact"/>
+        <w:numPr>
+          <w:ilvl w:val="0"/>
+          <w:numId w:val="1003"/>
+        </w:numPr>
+      </w:pPr>
+      <w:r>
+        <w:t xml:space="preserve">Ist das Kind schon erfasst? Sonst zuerst anlegen. Ist die Ansprechperson erfasst? Sonst</w:t>
+      </w:r>
+      <w:r>
+        <w:t xml:space="preserve"> </w:t>
+      </w:r>
+      <w:r>
+        <w:t xml:space="preserve">im Blatt «Ansprechpersonen» eine Zeile beim richtigen Leistungsbesteller anlegen.</w:t>
+      </w:r>
+    </w:p>
+    <w:p>
+      <w:pPr>
+        <w:pStyle w:val="Compact"/>
+        <w:numPr>
+          <w:ilvl w:val="0"/>
+          <w:numId w:val="1003"/>
+        </w:numPr>
+      </w:pPr>
+      <w:r>
+        <w:t xml:space="preserve">Blatt «Aufträge»: nächste Auftrag-Nr (A, Startjahr, nächster freier Zähler), Leistungsart,</w:t>
+      </w:r>
+      <w:r>
+        <w:t xml:space="preserve"> </w:t>
+      </w:r>
+      <w:r>
+        <w:t xml:space="preserve">Leistungsbesteller, Ansprechperson, Kostenträger, Standort, Geschäftsnummer, Bewilligung von</w:t>
+      </w:r>
+      <w:r>
+        <w:t xml:space="preserve"> </w:t>
+      </w:r>
+      <w:r>
+        <w:t xml:space="preserve">und bis, Kontingent, Zuweisungsgrundlage. Beim KJA (P1000) ist die Geschäftsnummer</w:t>
+      </w:r>
+      <w:r>
+        <w:t xml:space="preserve"> </w:t>
+      </w:r>
+      <w:r>
+        <w:t xml:space="preserve">yymmddnnn, mit dem Datum des Auftrags.</w:t>
+      </w:r>
+    </w:p>
+    <w:p>
+      <w:pPr>
+        <w:pStyle w:val="Compact"/>
+        <w:numPr>
+          <w:ilvl w:val="0"/>
+          <w:numId w:val="1003"/>
+        </w:numPr>
+      </w:pPr>
+      <w:r>
+        <w:t xml:space="preserve">Blatt «Betreuungen»: Auftrag-Nr, Kind-Nr und Eintritt, das ist der Beginn der Betreuung</w:t>
+      </w:r>
+      <w:r>
+        <w:t xml:space="preserve"> </w:t>
+      </w:r>
+      <w:r>
+        <w:t xml:space="preserve">dieses Kindes. Bei Geschwistern eine Zeile je betreutem Kind.</w:t>
+      </w:r>
+    </w:p>
+    <w:p>
+      <w:pPr>
+        <w:pStyle w:val="Compact"/>
+        <w:numPr>
+          <w:ilvl w:val="0"/>
+          <w:numId w:val="1003"/>
+        </w:numPr>
+      </w:pPr>
+      <w:r>
+        <w:t xml:space="preserve">Blatt «Zuordnung MA»: eine Zeile je Mitarbeitende. Die Person, die die Berichte erstellt,</w:t>
+      </w:r>
+      <w:r>
+        <w:t xml:space="preserve"> </w:t>
+      </w:r>
+      <w:r>
+        <w:t xml:space="preserve">bekommt die Rolle P.</w:t>
+      </w:r>
+    </w:p>
+    <w:p>
+      <w:pPr>
+        <w:pStyle w:val="Compact"/>
+        <w:numPr>
+          <w:ilvl w:val="0"/>
+          <w:numId w:val="1003"/>
+        </w:numPr>
+      </w:pPr>
+      <w:r>
+        <w:t xml:space="preserve">Blatt «Berichte»: die fälligen Berichte eintragen (Auftrag, Berichtsform, Fällig am).</w:t>
+      </w:r>
+      <w:r>
+        <w:t xml:space="preserve"> </w:t>
+      </w:r>
+      <w:r>
+        <w:t xml:space="preserve">Bei regelmässigen Berichten den Rhythmus am Auftrag ergänzen.</w:t>
+      </w:r>
+    </w:p>
+    <w:p>
+      <w:pPr>
+        <w:pStyle w:val="FirstParagraph"/>
+      </w:pPr>
+      <w:r>
+        <w:rPr>
+          <w:b/>
+          <w:bCs/>
+        </w:rPr>
+        <w:t xml:space="preserve">Verlängerung erfassen</w:t>
+      </w:r>
+      <w:r>
+        <w:t xml:space="preserve"> </w:t>
+      </w:r>
+      <w:r>
+        <w:t xml:space="preserve">(bestehenden Auftrag kopieren)</w:t>
+      </w:r>
+    </w:p>
+    <w:p>
+      <w:pPr>
+        <w:pStyle w:val="Compact"/>
+        <w:numPr>
+          <w:ilvl w:val="0"/>
+          <w:numId w:val="1004"/>
+        </w:numPr>
+      </w:pPr>
+      <w:r>
+        <w:t xml:space="preserve">Im Blatt «Aufträge» die Zeile des bisherigen Auftrags kopieren und darunter einfügen. Die</w:t>
+      </w:r>
+      <w:r>
+        <w:t xml:space="preserve"> </w:t>
+      </w:r>
+      <w:r>
+        <w:t xml:space="preserve">alte Zeile bleibt unverändert, auch «Bewilligung bis».</w:t>
+      </w:r>
+    </w:p>
+    <w:p>
+      <w:pPr>
+        <w:pStyle w:val="Compact"/>
+        <w:numPr>
+          <w:ilvl w:val="0"/>
+          <w:numId w:val="1004"/>
+        </w:numPr>
+      </w:pPr>
+      <w:r>
+        <w:t xml:space="preserve">In der Kopie ändern: Auftrag-Nr, «Bewilligung von» (Tag nach dem alten Ende), «Bewilligung</w:t>
+      </w:r>
+      <w:r>
+        <w:t xml:space="preserve"> </w:t>
+      </w:r>
+      <w:r>
+        <w:t xml:space="preserve">bis», Geschäftsnummer, wenn nötig Kontingent und Ansprechperson, dazu «Vorgängerauftrag»</w:t>
+      </w:r>
+      <w:r>
+        <w:t xml:space="preserve"> </w:t>
+      </w:r>
+      <w:r>
+        <w:t xml:space="preserve">(Auswahl, der alte Auftrag) und die Bemerkung. Wer die Auftrag-Nr vergisst, sieht «Auftrag-Nr</w:t>
+      </w:r>
+      <w:r>
+        <w:t xml:space="preserve"> </w:t>
+      </w:r>
+      <w:r>
+        <w:t xml:space="preserve">doppelt». Wer beim KJA die Geschäftsnummer vergisst, sieht «kommt mehrfach vor».</w:t>
+      </w:r>
+    </w:p>
+    <w:p>
+      <w:pPr>
+        <w:pStyle w:val="Compact"/>
+        <w:numPr>
+          <w:ilvl w:val="0"/>
+          <w:numId w:val="1004"/>
+        </w:numPr>
+      </w:pPr>
+      <w:r>
+        <w:t xml:space="preserve">Im Blatt «Betreuungen» die Zeilen des alten Auftrags kopieren und nur die Auftrag-Nr</w:t>
+      </w:r>
+      <w:r>
+        <w:t xml:space="preserve"> </w:t>
+      </w:r>
+      <w:r>
+        <w:t xml:space="preserve">ändern. Der Eintritt bleibt gleich, der Austritt leer.</w:t>
+      </w:r>
+    </w:p>
+    <w:p>
+      <w:pPr>
+        <w:pStyle w:val="Compact"/>
+        <w:numPr>
+          <w:ilvl w:val="0"/>
+          <w:numId w:val="1004"/>
+        </w:numPr>
+      </w:pPr>
+      <w:r>
+        <w:t xml:space="preserve">Im Blatt «Zuordnung MA» die Zeilen kopieren und die Auftrag-Nr ändern. Die Rollen bleiben.</w:t>
+      </w:r>
+    </w:p>
+    <w:p>
+      <w:pPr>
+        <w:pStyle w:val="Compact"/>
+        <w:numPr>
+          <w:ilvl w:val="0"/>
+          <w:numId w:val="1004"/>
+        </w:numPr>
+      </w:pPr>
+      <w:r>
+        <w:t xml:space="preserve">Im Blatt «Berichte» die Berichte des neuen Auftrags eintragen.</w:t>
+      </w:r>
+    </w:p>
+    <w:p>
+      <w:pPr>
+        <w:pStyle w:val="Compact"/>
+        <w:numPr>
+          <w:ilvl w:val="0"/>
+          <w:numId w:val="1004"/>
+        </w:numPr>
+      </w:pPr>
+      <w:r>
+        <w:t xml:space="preserve">Beim alten Auftrag bleibt der Hinweis «Bewilligung abgelaufen, Betreuung noch offen» stehen,</w:t>
+      </w:r>
+      <w:r>
+        <w:t xml:space="preserve"> </w:t>
+      </w:r>
+      <w:r>
+        <w:t xml:space="preserve">solange seine Betreuung keinen Austritt trägt. Bei einer Verlängerung ist das kein Fehler.</w:t>
+      </w:r>
+    </w:p>
+    <w:p>
+      <w:pPr>
+        <w:pStyle w:val="FirstParagraph"/>
+      </w:pPr>
+      <w:r>
+        <w:rPr>
+          <w:b/>
+          <w:bCs/>
+        </w:rPr>
+        <w:t xml:space="preserve">Neugeborenes in der Familie</w:t>
+      </w:r>
+    </w:p>
+    <w:p>
+      <w:pPr>
+        <w:pStyle w:val="Compact"/>
+        <w:numPr>
+          <w:ilvl w:val="0"/>
+          <w:numId w:val="1005"/>
+        </w:numPr>
+      </w:pPr>
+      <w:r>
+        <w:t xml:space="preserve">Kind mit Geburtsdatum und demselben Familientext anlegen. Das Indexkind wechselt damit von</w:t>
+      </w:r>
+      <w:r>
+        <w:t xml:space="preserve"> </w:t>
+      </w:r>
+      <w:r>
+        <w:t xml:space="preserve">selbst zum Neugeborenen.</w:t>
+      </w:r>
+    </w:p>
+    <w:p>
+      <w:pPr>
+        <w:pStyle w:val="Compact"/>
+        <w:numPr>
+          <w:ilvl w:val="0"/>
+          <w:numId w:val="1005"/>
+        </w:numPr>
+      </w:pPr>
+      <w:r>
+        <w:t xml:space="preserve">Den laufenden Auftrag wie bei einer Verlängerung kopieren. Er gilt für die ganze Familie, auch</w:t>
+      </w:r>
+      <w:r>
+        <w:t xml:space="preserve"> </w:t>
+      </w:r>
+      <w:r>
+        <w:t xml:space="preserve">wenn das Neugeborene nicht betreut wird. Vorgänger eintragen.</w:t>
+      </w:r>
+    </w:p>
+    <w:p>
+      <w:pPr>
+        <w:pStyle w:val="Compact"/>
+        <w:numPr>
+          <w:ilvl w:val="0"/>
+          <w:numId w:val="1005"/>
+        </w:numPr>
+      </w:pPr>
+      <w:r>
+        <w:t xml:space="preserve">Betreuungen für alle betreuten Kinder kopieren, für das Neugeborene eine neue Zeile, falls es</w:t>
+      </w:r>
+      <w:r>
+        <w:t xml:space="preserve"> </w:t>
+      </w:r>
+      <w:r>
+        <w:t xml:space="preserve">betreut wird.</w:t>
+      </w:r>
+    </w:p>
+    <w:p>
+      <w:pPr>
+        <w:pStyle w:val="Compact"/>
+        <w:numPr>
+          <w:ilvl w:val="0"/>
+          <w:numId w:val="1005"/>
+        </w:numPr>
+      </w:pPr>
+      <w:r>
+        <w:t xml:space="preserve">Zuordnung MA und Berichte wie bei der Verlängerung.</w:t>
+      </w:r>
+    </w:p>
+    <w:p>
+      <w:pPr>
+        <w:pStyle w:val="FirstParagraph"/>
+      </w:pPr>
+      <w:r>
+        <w:rPr>
+          <w:b/>
+          <w:bCs/>
+        </w:rPr>
+        <w:t xml:space="preserve">Auftrag oder Betreuung beenden</w:t>
+      </w:r>
+    </w:p>
+    <w:p>
+      <w:pPr>
+        <w:pStyle w:val="Compact"/>
+        <w:numPr>
+          <w:ilvl w:val="0"/>
+          <w:numId w:val="1006"/>
+        </w:numPr>
+      </w:pPr>
+      <w:r>
+        <w:t xml:space="preserve">Tritt ein Kind aus, dessen Betreuungszeile öffnen: Austritt, Grund und Situation danach eintragen.</w:t>
+      </w:r>
+      <w:r>
+        <w:t xml:space="preserve"> </w:t>
+      </w:r>
+      <w:r>
+        <w:t xml:space="preserve">Der Auftrag bleibt, solange andere Kinder weiterlaufen.</w:t>
+      </w:r>
+    </w:p>
+    <w:p>
+      <w:pPr>
+        <w:pStyle w:val="Compact"/>
+        <w:numPr>
+          <w:ilvl w:val="0"/>
+          <w:numId w:val="1006"/>
+        </w:numPr>
+      </w:pPr>
+      <w:r>
+        <w:t xml:space="preserve">Endet der ganze Auftrag, in «Aufträge» «Bewilligung bis» setzen und bei allen Betreuungen den</w:t>
+      </w:r>
+      <w:r>
+        <w:t xml:space="preserve"> </w:t>
+      </w:r>
+      <w:r>
+        <w:t xml:space="preserve">Austritt eintragen.</w:t>
+      </w:r>
+    </w:p>
+    <w:p>
+      <w:pPr>
+        <w:pStyle w:val="Compact"/>
+        <w:numPr>
+          <w:ilvl w:val="0"/>
+          <w:numId w:val="1006"/>
+        </w:numPr>
+      </w:pPr>
+      <w:r>
+        <w:t xml:space="preserve">Die Zeilen in «Zuordnung MA» entfernen, sonst entstehen weiter Erfassungsbögen.</w:t>
+      </w:r>
+    </w:p>
+    <w:p>
+      <w:pPr>
+        <w:pStyle w:val="FirstParagraph"/>
+      </w:pPr>
+      <w:r>
+        <w:rPr>
+          <w:b/>
+          <w:bCs/>
+        </w:rPr>
+        <w:t xml:space="preserve">Vertretung</w:t>
+      </w:r>
+    </w:p>
+    <w:p>
+      <w:pPr>
+        <w:pStyle w:val="BodyText"/>
+      </w:pPr>
+      <w:r>
+        <w:t xml:space="preserve">Zeile in «Zuordnung MA» mit Rolle S ergänzen, nach dem Einsatz wieder entfernen.</w:t>
+      </w:r>
+    </w:p>
+    <w:bookmarkEnd w:id="25"/>
+    <w:bookmarkStart w:id="26" w:name="regeln-die-man-sich-merken-muss"/>
+    <w:p>
+      <w:pPr>
+        <w:pStyle w:val="Heading3"/>
+      </w:pPr>
+      <w:r>
+        <w:t xml:space="preserve">Regeln, die man sich merken muss</w:t>
+      </w:r>
+    </w:p>
+    <w:p>
+      <w:pPr>
+        <w:pStyle w:val="Compact"/>
+        <w:numPr>
+          <w:ilvl w:val="0"/>
+          <w:numId w:val="1007"/>
+        </w:numPr>
+      </w:pPr>
+      <w:r>
         <w:rPr>
           <w:b/>
           <w:bCs/>
@@ -1509,7 +2033,7 @@
         <w:pStyle w:val="Compact"/>
         <w:numPr>
           <w:ilvl w:val="0"/>
-          <w:numId w:val="1002"/>
+          <w:numId w:val="1007"/>
         </w:numPr>
       </w:pPr>
       <w:r>
@@ -1543,7 +2067,7 @@
         <w:pStyle w:val="Compact"/>
         <w:numPr>
           <w:ilvl w:val="0"/>
-          <w:numId w:val="1002"/>
+          <w:numId w:val="1007"/>
         </w:numPr>
       </w:pPr>
       <w:r>
@@ -1571,7 +2095,7 @@
         <w:pStyle w:val="Compact"/>
         <w:numPr>
           <w:ilvl w:val="0"/>
-          <w:numId w:val="1002"/>
+          <w:numId w:val="1007"/>
         </w:numPr>
       </w:pPr>
       <w:r>
@@ -1593,7 +2117,7 @@
         <w:pStyle w:val="Compact"/>
         <w:numPr>
           <w:ilvl w:val="0"/>
-          <w:numId w:val="1002"/>
+          <w:numId w:val="1007"/>
         </w:numPr>
       </w:pPr>
       <w:r>
@@ -1616,9 +2140,9 @@
         <w:t xml:space="preserve">Ein nicht erfasstes Geschwisterkind findet keine Prüfung.</w:t>
       </w:r>
     </w:p>
-    <w:bookmarkEnd w:id="25"/>
     <w:bookmarkEnd w:id="26"/>
-    <w:bookmarkStart w:id="27" w:name="für-die-umsetzung-in-den-programmen"/>
+    <w:bookmarkEnd w:id="27"/>
+    <w:bookmarkStart w:id="28" w:name="für-die-umsetzung-in-den-programmen"/>
     <w:p>
       <w:pPr>
         <w:pStyle w:val="Heading2"/>
@@ -1655,7 +2179,7 @@
         <w:pStyle w:val="Compact"/>
         <w:numPr>
           <w:ilvl w:val="0"/>
-          <w:numId w:val="1003"/>
+          <w:numId w:val="1008"/>
         </w:numPr>
       </w:pPr>
       <w:r>
@@ -1706,7 +2230,7 @@
         <w:pStyle w:val="Compact"/>
         <w:numPr>
           <w:ilvl w:val="0"/>
-          <w:numId w:val="1003"/>
+          <w:numId w:val="1008"/>
         </w:numPr>
       </w:pPr>
       <w:r>
@@ -1775,7 +2299,7 @@
         <w:pStyle w:val="Compact"/>
         <w:numPr>
           <w:ilvl w:val="0"/>
-          <w:numId w:val="1003"/>
+          <w:numId w:val="1008"/>
         </w:numPr>
       </w:pPr>
       <w:r>
@@ -1835,7 +2359,7 @@
         <w:pStyle w:val="Compact"/>
         <w:numPr>
           <w:ilvl w:val="0"/>
-          <w:numId w:val="1003"/>
+          <w:numId w:val="1008"/>
         </w:numPr>
       </w:pPr>
       <w:r>
@@ -1859,7 +2383,7 @@
         <w:pStyle w:val="Compact"/>
         <w:numPr>
           <w:ilvl w:val="0"/>
-          <w:numId w:val="1003"/>
+          <w:numId w:val="1008"/>
         </w:numPr>
       </w:pPr>
       <w:r>
@@ -1872,8 +2396,8 @@
         <w:t xml:space="preserve">aufdecken, gehört zum Zweck der Übung.</w:t>
       </w:r>
     </w:p>
-    <w:bookmarkEnd w:id="27"/>
     <w:bookmarkEnd w:id="28"/>
+    <w:bookmarkEnd w:id="29"/>
     <w:sectPr/>
   </w:body>
 </w:document>
@@ -2175,9 +2699,159 @@
     </w:lvlOverride>
   </w:num>
   <w:num w:numId="1002">
+    <w:abstractNumId w:val="99411"/>
+    <w:lvlOverride w:ilvl="0">
+      <w:startOverride w:val="1"/>
+    </w:lvlOverride>
+    <w:lvlOverride w:ilvl="1">
+      <w:startOverride w:val="1"/>
+    </w:lvlOverride>
+    <w:lvlOverride w:ilvl="2">
+      <w:startOverride w:val="1"/>
+    </w:lvlOverride>
+    <w:lvlOverride w:ilvl="3">
+      <w:startOverride w:val="1"/>
+    </w:lvlOverride>
+    <w:lvlOverride w:ilvl="4">
+      <w:startOverride w:val="1"/>
+    </w:lvlOverride>
+    <w:lvlOverride w:ilvl="5">
+      <w:startOverride w:val="1"/>
+    </w:lvlOverride>
+    <w:lvlOverride w:ilvl="6">
+      <w:startOverride w:val="1"/>
+    </w:lvlOverride>
+    <w:lvlOverride w:ilvl="7">
+      <w:startOverride w:val="1"/>
+    </w:lvlOverride>
+    <w:lvlOverride w:ilvl="8">
+      <w:startOverride w:val="1"/>
+    </w:lvlOverride>
+  </w:num>
+  <w:num w:numId="1003">
+    <w:abstractNumId w:val="99411"/>
+    <w:lvlOverride w:ilvl="0">
+      <w:startOverride w:val="1"/>
+    </w:lvlOverride>
+    <w:lvlOverride w:ilvl="1">
+      <w:startOverride w:val="1"/>
+    </w:lvlOverride>
+    <w:lvlOverride w:ilvl="2">
+      <w:startOverride w:val="1"/>
+    </w:lvlOverride>
+    <w:lvlOverride w:ilvl="3">
+      <w:startOverride w:val="1"/>
+    </w:lvlOverride>
+    <w:lvlOverride w:ilvl="4">
+      <w:startOverride w:val="1"/>
+    </w:lvlOverride>
+    <w:lvlOverride w:ilvl="5">
+      <w:startOverride w:val="1"/>
+    </w:lvlOverride>
+    <w:lvlOverride w:ilvl="6">
+      <w:startOverride w:val="1"/>
+    </w:lvlOverride>
+    <w:lvlOverride w:ilvl="7">
+      <w:startOverride w:val="1"/>
+    </w:lvlOverride>
+    <w:lvlOverride w:ilvl="8">
+      <w:startOverride w:val="1"/>
+    </w:lvlOverride>
+  </w:num>
+  <w:num w:numId="1004">
+    <w:abstractNumId w:val="99411"/>
+    <w:lvlOverride w:ilvl="0">
+      <w:startOverride w:val="1"/>
+    </w:lvlOverride>
+    <w:lvlOverride w:ilvl="1">
+      <w:startOverride w:val="1"/>
+    </w:lvlOverride>
+    <w:lvlOverride w:ilvl="2">
+      <w:startOverride w:val="1"/>
+    </w:lvlOverride>
+    <w:lvlOverride w:ilvl="3">
+      <w:startOverride w:val="1"/>
+    </w:lvlOverride>
+    <w:lvlOverride w:ilvl="4">
+      <w:startOverride w:val="1"/>
+    </w:lvlOverride>
+    <w:lvlOverride w:ilvl="5">
+      <w:startOverride w:val="1"/>
+    </w:lvlOverride>
+    <w:lvlOverride w:ilvl="6">
+      <w:startOverride w:val="1"/>
+    </w:lvlOverride>
+    <w:lvlOverride w:ilvl="7">
+      <w:startOverride w:val="1"/>
+    </w:lvlOverride>
+    <w:lvlOverride w:ilvl="8">
+      <w:startOverride w:val="1"/>
+    </w:lvlOverride>
+  </w:num>
+  <w:num w:numId="1005">
+    <w:abstractNumId w:val="99411"/>
+    <w:lvlOverride w:ilvl="0">
+      <w:startOverride w:val="1"/>
+    </w:lvlOverride>
+    <w:lvlOverride w:ilvl="1">
+      <w:startOverride w:val="1"/>
+    </w:lvlOverride>
+    <w:lvlOverride w:ilvl="2">
+      <w:startOverride w:val="1"/>
+    </w:lvlOverride>
+    <w:lvlOverride w:ilvl="3">
+      <w:startOverride w:val="1"/>
+    </w:lvlOverride>
+    <w:lvlOverride w:ilvl="4">
+      <w:startOverride w:val="1"/>
+    </w:lvlOverride>
+    <w:lvlOverride w:ilvl="5">
+      <w:startOverride w:val="1"/>
+    </w:lvlOverride>
+    <w:lvlOverride w:ilvl="6">
+      <w:startOverride w:val="1"/>
+    </w:lvlOverride>
+    <w:lvlOverride w:ilvl="7">
+      <w:startOverride w:val="1"/>
+    </w:lvlOverride>
+    <w:lvlOverride w:ilvl="8">
+      <w:startOverride w:val="1"/>
+    </w:lvlOverride>
+  </w:num>
+  <w:num w:numId="1006">
+    <w:abstractNumId w:val="99411"/>
+    <w:lvlOverride w:ilvl="0">
+      <w:startOverride w:val="1"/>
+    </w:lvlOverride>
+    <w:lvlOverride w:ilvl="1">
+      <w:startOverride w:val="1"/>
+    </w:lvlOverride>
+    <w:lvlOverride w:ilvl="2">
+      <w:startOverride w:val="1"/>
+    </w:lvlOverride>
+    <w:lvlOverride w:ilvl="3">
+      <w:startOverride w:val="1"/>
+    </w:lvlOverride>
+    <w:lvlOverride w:ilvl="4">
+      <w:startOverride w:val="1"/>
+    </w:lvlOverride>
+    <w:lvlOverride w:ilvl="5">
+      <w:startOverride w:val="1"/>
+    </w:lvlOverride>
+    <w:lvlOverride w:ilvl="6">
+      <w:startOverride w:val="1"/>
+    </w:lvlOverride>
+    <w:lvlOverride w:ilvl="7">
+      <w:startOverride w:val="1"/>
+    </w:lvlOverride>
+    <w:lvlOverride w:ilvl="8">
+      <w:startOverride w:val="1"/>
+    </w:lvlOverride>
+  </w:num>
+  <w:num w:numId="1007">
     <w:abstractNumId w:val="991"/>
   </w:num>
-  <w:num w:numId="1003">
+  <w:num w:numId="1008">
     <w:abstractNumId w:val="99411"/>
     <w:lvlOverride w:ilvl="0">
       <w:startOverride w:val="1"/>

</xml_diff>

<commit_message>
Group workbook inputs and document complete client report requirement
</commit_message>
<xml_diff>
--- a/docs/runbook_umstellung_datenmodell.docx
+++ b/docs/runbook_umstellung_datenmodell.docx
@@ -2,7 +2,7 @@
 <file path=word/document.xml><?xml version="1.0" encoding="utf-8"?>
 <w:document xmlns:w="http://schemas.openxmlformats.org/wordprocessingml/2006/main" xmlns:m="http://schemas.openxmlformats.org/officeDocument/2006/math" xmlns:r="http://schemas.openxmlformats.org/officeDocument/2006/relationships" xmlns:o="urn:schemas-microsoft-com:office:office" xmlns:v="urn:schemas-microsoft-com:vml" xmlns:w10="urn:schemas-microsoft-com:office:word" xmlns:a="http://schemas.openxmlformats.org/drawingml/2006/main" xmlns:pic="http://schemas.openxmlformats.org/drawingml/2006/picture" xmlns:wp="http://schemas.openxmlformats.org/drawingml/2006/wordprocessingDrawing">
   <w:body>
-    <w:bookmarkStart w:id="29" w:name="X252f31a3cd1c52806cc27230c7fbb84f45ebfcc"/>
+    <w:bookmarkStart w:id="34" w:name="X252f31a3cd1c52806cc27230c7fbb84f45ebfcc"/>
     <w:p>
       <w:pPr>
         <w:pStyle w:val="Heading1"/>
@@ -16,13 +16,13 @@
         <w:pStyle w:val="FirstParagraph"/>
       </w:pPr>
       <w:r>
-        <w:t xml:space="preserve">Stand 25.09.2026. Was sich geändert hat, was einmalig zu tun ist und was künftig bei welchem</w:t>
-      </w:r>
-      <w:r>
-        <w:t xml:space="preserve"> </w:t>
-      </w:r>
-      <w:r>
-        <w:t xml:space="preserve">Ereignis gepflegt wird. Den Hintergrund erklärt das</w:t>
+        <w:t xml:space="preserve">Stand 11.10.2026. Dieses Runbook beschreibt die kundenseitige Datenpflege. Den Hintergrund</w:t>
+      </w:r>
+      <w:r>
+        <w:t xml:space="preserve"> </w:t>
+      </w:r>
+      <w:r>
+        <w:t xml:space="preserve">erklärt das</w:t>
       </w:r>
       <w:r>
         <w:t xml:space="preserve"> </w:t>
@@ -36,13 +36,7 @@
         </w:r>
       </w:hyperlink>
       <w:r>
-        <w:t xml:space="preserve">,</w:t>
-      </w:r>
-      <w:r>
-        <w:t xml:space="preserve"> </w:t>
-      </w:r>
-      <w:r>
-        <w:t xml:space="preserve">die Felder und Regeln stehen im</w:t>
+        <w:t xml:space="preserve">, die Felder und Regeln stehen im</w:t>
       </w:r>
       <w:r>
         <w:t xml:space="preserve"> </w:t>
@@ -56,13 +50,7 @@
         </w:r>
       </w:hyperlink>
       <w:r>
-        <w:t xml:space="preserve">. Der</w:t>
-      </w:r>
-      <w:r>
-        <w:t xml:space="preserve"> </w:t>
-      </w:r>
-      <w:r>
-        <w:t xml:space="preserve">monatliche Abrechnungslauf bleibt wie im</w:t>
+        <w:t xml:space="preserve">. Für den CLI-Monatslauf gilt das</w:t>
       </w:r>
       <w:r>
         <w:t xml:space="preserve"> </w:t>
@@ -76,13 +64,7 @@
         </w:r>
       </w:hyperlink>
       <w:r>
-        <w:t xml:space="preserve">, bis die</w:t>
-      </w:r>
-      <w:r>
-        <w:t xml:space="preserve"> </w:t>
-      </w:r>
-      <w:r>
-        <w:t xml:space="preserve">Programme auf das neue Modell umgestellt sind.</w:t>
+        <w:t xml:space="preserve">.</w:t>
       </w:r>
     </w:p>
     <w:p>
@@ -90,25 +72,19 @@
         <w:pStyle w:val="BodyText"/>
       </w:pPr>
       <w:r>
-        <w:t xml:space="preserve">Arbeitsdatei ist vorerst</w:t>
-      </w:r>
-      <w:r>
-        <w:t xml:space="preserve"> </w:t>
-      </w:r>
-      <w:r>
-        <w:rPr>
-          <w:rStyle w:val="VerbatimChar"/>
-        </w:rPr>
-        <w:t xml:space="preserve">sandbox/wegpiraten_datenbank_neu.xlsx</w:t>
-      </w:r>
-      <w:r>
-        <w:t xml:space="preserve">. Sie ist ein Testbuild aus</w:t>
-      </w:r>
-      <w:r>
-        <w:t xml:space="preserve"> </w:t>
-      </w:r>
-      <w:r>
-        <w:t xml:space="preserve">der Klientenliste vom 24.09.2026, keine Produktivdatei.</w:t>
+        <w:t xml:space="preserve">Nach der Windows-Excel-Prüfung und Übergabe wird das finale Workbook die gemeinsame</w:t>
+      </w:r>
+      <w:r>
+        <w:t xml:space="preserve"> </w:t>
+      </w:r>
+      <w:r>
+        <w:t xml:space="preserve">Arbeitsgrundlage. Der Kunde pflegt dieses Workbook; die SQLite-Datenbank wird daraus und</w:t>
+      </w:r>
+      <w:r>
+        <w:t xml:space="preserve"> </w:t>
+      </w:r>
+      <w:r>
+        <w:t xml:space="preserve">aus den ausgefüllten Bögen neu aufgebaut. Befunde werden fachlich im Workbook korrigiert.</w:t>
       </w:r>
     </w:p>
     <w:bookmarkStart w:id="23" w:name="was-sich-geändert-hat"/>
@@ -135,6 +111,7 @@
       <w:tr>
         <w:trPr>
           <w:tblHeader w:val="on"/>
+          <w:cantSplit/>
         </w:trPr>
         <w:tc>
           <w:tcPr/>
@@ -162,6 +139,9 @@
         </w:tc>
       </w:tr>
       <w:tr>
+        <w:trPr>
+          <w:cantSplit/>
+        </w:trPr>
         <w:tc>
           <w:tcPr/>
           <w:p>
@@ -188,6 +168,9 @@
         </w:tc>
       </w:tr>
       <w:tr>
+        <w:trPr>
+          <w:cantSplit/>
+        </w:trPr>
         <w:tc>
           <w:tcPr/>
           <w:p>
@@ -214,6 +197,9 @@
         </w:tc>
       </w:tr>
       <w:tr>
+        <w:trPr>
+          <w:cantSplit/>
+        </w:trPr>
         <w:tc>
           <w:tcPr/>
           <w:p>
@@ -240,6 +226,9 @@
         </w:tc>
       </w:tr>
       <w:tr>
+        <w:trPr>
+          <w:cantSplit/>
+        </w:trPr>
         <w:tc>
           <w:tcPr/>
           <w:p>
@@ -266,6 +255,9 @@
         </w:tc>
       </w:tr>
       <w:tr>
+        <w:trPr>
+          <w:cantSplit/>
+        </w:trPr>
         <w:tc>
           <w:tcPr/>
           <w:p>
@@ -292,6 +284,9 @@
         </w:tc>
       </w:tr>
       <w:tr>
+        <w:trPr>
+          <w:cantSplit/>
+        </w:trPr>
         <w:tc>
           <w:tcPr/>
           <w:p>
@@ -318,6 +313,9 @@
         </w:tc>
       </w:tr>
       <w:tr>
+        <w:trPr>
+          <w:cantSplit/>
+        </w:trPr>
         <w:tc>
           <w:tcPr/>
           <w:p>
@@ -345,7 +343,1080 @@
       </w:tr>
     </w:tbl>
     <w:bookmarkEnd w:id="23"/>
-    <w:bookmarkStart w:id="24" w:name="einmalig-zu-tun"/>
+    <w:bookmarkStart w:id="26" w:name="X57c913410347d03c820034936ffefd50e621294"/>
+    <w:p>
+      <w:pPr>
+        <w:pStyle w:val="Heading2"/>
+      </w:pPr>
+      <w:r>
+        <w:t xml:space="preserve">Formeln nicht bearbeiten: hier keine Daten hineinkopieren</w:t>
+      </w:r>
+    </w:p>
+    <w:p>
+      <w:pPr>
+        <w:pStyle w:val="FirstParagraph"/>
+      </w:pPr>
+      <w:r>
+        <w:t xml:space="preserve">Nur Eingabefelder ändern. Berechnete und ausgeblendete Spalten nicht überschreiben,</w:t>
+      </w:r>
+      <w:r>
+        <w:t xml:space="preserve"> </w:t>
+      </w:r>
+      <w:r>
+        <w:t xml:space="preserve">leeren oder mit Daten aus anderen Dateien füllen. Auch «Nur Werte einfügen» zerstört</w:t>
+      </w:r>
+      <w:r>
+        <w:t xml:space="preserve"> </w:t>
+      </w:r>
+      <w:r>
+        <w:t xml:space="preserve">eine Formel, wenn der Zielbereich eine Formelzelle enthält. Die Blätter «Prüfungen»</w:t>
+      </w:r>
+      <w:r>
+        <w:t xml:space="preserve"> </w:t>
+      </w:r>
+      <w:r>
+        <w:t xml:space="preserve">und «Fehlerliste» sind berechnete Ansichten; dort keine Stammdaten eintragen.</w:t>
+      </w:r>
+    </w:p>
+    <w:p>
+      <w:pPr>
+        <w:pStyle w:val="BodyText"/>
+      </w:pPr>
+      <w:r>
+        <w:t xml:space="preserve">Für den aktuellen Spaltenstand gilt:</w:t>
+      </w:r>
+    </w:p>
+    <w:tbl>
+      <w:tblPr>
+        <w:tblStyle w:val="Table"/>
+        <w:tblW w:type="pct" w:w="5000"/>
+        <w:jc w:val="left"/>
+        <w:tblLayout w:type="fixed"/>
+        <w:tblLook w:firstRow="1" w:lastRow="0" w:firstColumn="0" w:lastColumn="0" w:noHBand="0" w:noVBand="0" w:val="0020"/>
+      </w:tblPr>
+      <w:tblGrid>
+        <w:gridCol w:w="2640"/>
+        <w:gridCol w:w="2640"/>
+        <w:gridCol w:w="2640"/>
+      </w:tblGrid>
+      <w:tr>
+        <w:trPr>
+          <w:tblHeader w:val="on"/>
+          <w:cantSplit/>
+        </w:trPr>
+        <w:tc>
+          <w:tcPr/>
+          <w:p>
+            <w:pPr>
+              <w:pStyle w:val="Compact"/>
+              <w:jc w:val="left"/>
+            </w:pPr>
+            <w:r>
+              <w:t xml:space="preserve">Blatt</w:t>
+            </w:r>
+          </w:p>
+        </w:tc>
+        <w:tc>
+          <w:tcPr/>
+          <w:p>
+            <w:pPr>
+              <w:pStyle w:val="Compact"/>
+              <w:jc w:val="left"/>
+            </w:pPr>
+            <w:r>
+              <w:t xml:space="preserve">Hier dürfen Daten eingegeben oder als Werte eingefügt werden</w:t>
+            </w:r>
+          </w:p>
+        </w:tc>
+        <w:tc>
+          <w:tcPr/>
+          <w:p>
+            <w:pPr>
+              <w:pStyle w:val="Compact"/>
+              <w:jc w:val="left"/>
+            </w:pPr>
+            <w:r>
+              <w:t xml:space="preserve">Nicht bearbeiten / nicht hineinkopieren</w:t>
+            </w:r>
+          </w:p>
+        </w:tc>
+      </w:tr>
+      <w:tr>
+        <w:trPr>
+          <w:cantSplit/>
+        </w:trPr>
+        <w:tc>
+          <w:tcPr/>
+          <w:p>
+            <w:pPr>
+              <w:pStyle w:val="Compact"/>
+              <w:jc w:val="left"/>
+            </w:pPr>
+            <w:r>
+              <w:t xml:space="preserve">Kinder</w:t>
+            </w:r>
+          </w:p>
+        </w:tc>
+        <w:tc>
+          <w:tcPr/>
+          <w:p>
+            <w:pPr>
+              <w:pStyle w:val="Compact"/>
+              <w:jc w:val="left"/>
+            </w:pPr>
+            <w:r>
+              <w:t xml:space="preserve">A:Q, einschliesslich Wohnort/Kontakt Kind</w:t>
+            </w:r>
+          </w:p>
+        </w:tc>
+        <w:tc>
+          <w:tcPr/>
+          <w:p>
+            <w:pPr>
+              <w:pStyle w:val="Compact"/>
+              <w:jc w:val="left"/>
+            </w:pPr>
+            <w:r>
+              <w:t xml:space="preserve">R:AG, berechnete Anzeigen und Prüfungen</w:t>
+            </w:r>
+          </w:p>
+        </w:tc>
+      </w:tr>
+      <w:tr>
+        <w:trPr>
+          <w:cantSplit/>
+        </w:trPr>
+        <w:tc>
+          <w:tcPr/>
+          <w:p>
+            <w:pPr>
+              <w:pStyle w:val="Compact"/>
+              <w:jc w:val="left"/>
+            </w:pPr>
+            <w:r>
+              <w:t xml:space="preserve">Aufträge</w:t>
+            </w:r>
+          </w:p>
+        </w:tc>
+        <w:tc>
+          <w:tcPr/>
+          <w:p>
+            <w:pPr>
+              <w:pStyle w:val="Compact"/>
+              <w:jc w:val="left"/>
+            </w:pPr>
+            <w:r>
+              <w:t xml:space="preserve">A:Q</w:t>
+            </w:r>
+          </w:p>
+        </w:tc>
+        <w:tc>
+          <w:tcPr/>
+          <w:p>
+            <w:pPr>
+              <w:pStyle w:val="Compact"/>
+              <w:jc w:val="left"/>
+            </w:pPr>
+            <w:r>
+              <w:t xml:space="preserve">R:AP, berechnete Anzeigen, Verweise und Prüfungen</w:t>
+            </w:r>
+          </w:p>
+        </w:tc>
+      </w:tr>
+      <w:tr>
+        <w:trPr>
+          <w:cantSplit/>
+        </w:trPr>
+        <w:tc>
+          <w:tcPr/>
+          <w:p>
+            <w:pPr>
+              <w:pStyle w:val="Compact"/>
+              <w:jc w:val="left"/>
+            </w:pPr>
+            <w:r>
+              <w:t xml:space="preserve">Betreuungen</w:t>
+            </w:r>
+          </w:p>
+        </w:tc>
+        <w:tc>
+          <w:tcPr/>
+          <w:p>
+            <w:pPr>
+              <w:pStyle w:val="Compact"/>
+              <w:jc w:val="left"/>
+            </w:pPr>
+            <w:r>
+              <w:t xml:space="preserve">A:L</w:t>
+            </w:r>
+          </w:p>
+        </w:tc>
+        <w:tc>
+          <w:tcPr/>
+          <w:p>
+            <w:pPr>
+              <w:pStyle w:val="Compact"/>
+              <w:jc w:val="left"/>
+            </w:pPr>
+            <w:r>
+              <w:t xml:space="preserve">M:AD, berechnete Anzeigen und Prüfungen</w:t>
+            </w:r>
+          </w:p>
+        </w:tc>
+      </w:tr>
+      <w:tr>
+        <w:trPr>
+          <w:cantSplit/>
+        </w:trPr>
+        <w:tc>
+          <w:tcPr/>
+          <w:p>
+            <w:pPr>
+              <w:pStyle w:val="Compact"/>
+              <w:jc w:val="left"/>
+            </w:pPr>
+            <w:r>
+              <w:t xml:space="preserve">Zuordnung MA</w:t>
+            </w:r>
+          </w:p>
+        </w:tc>
+        <w:tc>
+          <w:tcPr/>
+          <w:p>
+            <w:pPr>
+              <w:pStyle w:val="Compact"/>
+              <w:jc w:val="left"/>
+            </w:pPr>
+            <w:r>
+              <w:t xml:space="preserve">A:E, einschliesslich Gültig ab / Gültig bis</w:t>
+            </w:r>
+          </w:p>
+        </w:tc>
+        <w:tc>
+          <w:tcPr/>
+          <w:p>
+            <w:pPr>
+              <w:pStyle w:val="Compact"/>
+              <w:jc w:val="left"/>
+            </w:pPr>
+            <w:r>
+              <w:t xml:space="preserve">F:Q, berechnete Anzeigen und Prüfungen</w:t>
+            </w:r>
+          </w:p>
+        </w:tc>
+      </w:tr>
+      <w:tr>
+        <w:trPr>
+          <w:cantSplit/>
+        </w:trPr>
+        <w:tc>
+          <w:tcPr/>
+          <w:p>
+            <w:pPr>
+              <w:pStyle w:val="Compact"/>
+              <w:jc w:val="left"/>
+            </w:pPr>
+            <w:r>
+              <w:t xml:space="preserve">Ansprechpersonen</w:t>
+            </w:r>
+          </w:p>
+        </w:tc>
+        <w:tc>
+          <w:tcPr/>
+          <w:p>
+            <w:pPr>
+              <w:pStyle w:val="Compact"/>
+              <w:jc w:val="left"/>
+            </w:pPr>
+            <w:r>
+              <w:t xml:space="preserve">A:H, einschliesslich Telefon/E-Mail</w:t>
+            </w:r>
+          </w:p>
+        </w:tc>
+        <w:tc>
+          <w:tcPr/>
+          <w:p>
+            <w:pPr>
+              <w:pStyle w:val="Compact"/>
+              <w:jc w:val="left"/>
+            </w:pPr>
+            <w:r>
+              <w:t xml:space="preserve">I:P, berechnete Anzeigen und Prüfungen</w:t>
+            </w:r>
+          </w:p>
+        </w:tc>
+      </w:tr>
+      <w:tr>
+        <w:trPr>
+          <w:cantSplit/>
+        </w:trPr>
+        <w:tc>
+          <w:tcPr/>
+          <w:p>
+            <w:pPr>
+              <w:pStyle w:val="Compact"/>
+              <w:jc w:val="left"/>
+            </w:pPr>
+            <w:r>
+              <w:t xml:space="preserve">Berichte</w:t>
+            </w:r>
+          </w:p>
+        </w:tc>
+        <w:tc>
+          <w:tcPr/>
+          <w:p>
+            <w:pPr>
+              <w:pStyle w:val="Compact"/>
+              <w:jc w:val="left"/>
+            </w:pPr>
+            <w:r>
+              <w:t xml:space="preserve">A:G</w:t>
+            </w:r>
+          </w:p>
+        </w:tc>
+        <w:tc>
+          <w:tcPr/>
+          <w:p>
+            <w:pPr>
+              <w:pStyle w:val="Compact"/>
+              <w:jc w:val="left"/>
+            </w:pPr>
+            <w:r>
+              <w:rPr>
+                <w:b/>
+                <w:bCs/>
+              </w:rPr>
+              <w:t xml:space="preserve">H</w:t>
+            </w:r>
+            <w:r>
+              <w:t xml:space="preserve"> </w:t>
+            </w:r>
+            <w:r>
+              <w:t xml:space="preserve">(berechnete Auftrag-Nr) sowie I:T</w:t>
+            </w:r>
+          </w:p>
+        </w:tc>
+      </w:tr>
+      <w:tr>
+        <w:trPr>
+          <w:cantSplit/>
+        </w:trPr>
+        <w:tc>
+          <w:tcPr/>
+          <w:p>
+            <w:pPr>
+              <w:pStyle w:val="Compact"/>
+              <w:jc w:val="left"/>
+            </w:pPr>
+            <w:r>
+              <w:t xml:space="preserve">Kostenträger</w:t>
+            </w:r>
+          </w:p>
+        </w:tc>
+        <w:tc>
+          <w:tcPr/>
+          <w:p>
+            <w:pPr>
+              <w:pStyle w:val="Compact"/>
+              <w:jc w:val="left"/>
+            </w:pPr>
+            <w:r>
+              <w:t xml:space="preserve">B:I, einschliesslich E-Mail Rechnung</w:t>
+            </w:r>
+          </w:p>
+        </w:tc>
+        <w:tc>
+          <w:tcPr/>
+          <w:p>
+            <w:pPr>
+              <w:pStyle w:val="Compact"/>
+              <w:jc w:val="left"/>
+            </w:pPr>
+            <w:r>
+              <w:t xml:space="preserve">Technische Überschriften nicht verändern</w:t>
+            </w:r>
+          </w:p>
+        </w:tc>
+      </w:tr>
+      <w:tr>
+        <w:trPr>
+          <w:cantSplit/>
+        </w:trPr>
+        <w:tc>
+          <w:tcPr/>
+          <w:p>
+            <w:pPr>
+              <w:pStyle w:val="Compact"/>
+              <w:jc w:val="left"/>
+            </w:pPr>
+            <w:r>
+              <w:t xml:space="preserve">Bezugspersonen</w:t>
+            </w:r>
+          </w:p>
+        </w:tc>
+        <w:tc>
+          <w:tcPr/>
+          <w:p>
+            <w:pPr>
+              <w:pStyle w:val="Compact"/>
+              <w:jc w:val="left"/>
+            </w:pPr>
+            <w:r>
+              <w:t xml:space="preserve">A:I</w:t>
+            </w:r>
+          </w:p>
+        </w:tc>
+        <w:tc>
+          <w:tcPr/>
+          <w:p>
+            <w:pPr>
+              <w:pStyle w:val="Compact"/>
+              <w:jc w:val="left"/>
+            </w:pPr>
+            <w:r>
+              <w:t xml:space="preserve">J:N, Prüfungen</w:t>
+            </w:r>
+          </w:p>
+        </w:tc>
+      </w:tr>
+      <w:tr>
+        <w:trPr>
+          <w:cantSplit/>
+        </w:trPr>
+        <w:tc>
+          <w:tcPr/>
+          <w:p>
+            <w:pPr>
+              <w:pStyle w:val="Compact"/>
+              <w:jc w:val="left"/>
+            </w:pPr>
+            <w:r>
+              <w:t xml:space="preserve">Kind-Bezugsperson</w:t>
+            </w:r>
+          </w:p>
+        </w:tc>
+        <w:tc>
+          <w:tcPr/>
+          <w:p>
+            <w:pPr>
+              <w:pStyle w:val="Compact"/>
+              <w:jc w:val="left"/>
+            </w:pPr>
+            <w:r>
+              <w:t xml:space="preserve">A:F</w:t>
+            </w:r>
+          </w:p>
+        </w:tc>
+        <w:tc>
+          <w:tcPr/>
+          <w:p>
+            <w:pPr>
+              <w:pStyle w:val="Compact"/>
+              <w:jc w:val="left"/>
+            </w:pPr>
+            <w:r>
+              <w:t xml:space="preserve">G:M, Anzeigen und Prüfungen</w:t>
+            </w:r>
+          </w:p>
+        </w:tc>
+      </w:tr>
+      <w:tr>
+        <w:trPr>
+          <w:cantSplit/>
+        </w:trPr>
+        <w:tc>
+          <w:tcPr/>
+          <w:p>
+            <w:pPr>
+              <w:pStyle w:val="Compact"/>
+              <w:jc w:val="left"/>
+            </w:pPr>
+            <w:r>
+              <w:t xml:space="preserve">Platzierungen</w:t>
+            </w:r>
+          </w:p>
+        </w:tc>
+        <w:tc>
+          <w:tcPr/>
+          <w:p>
+            <w:pPr>
+              <w:pStyle w:val="Compact"/>
+              <w:jc w:val="left"/>
+            </w:pPr>
+            <w:r>
+              <w:t xml:space="preserve">A:K</w:t>
+            </w:r>
+          </w:p>
+        </w:tc>
+        <w:tc>
+          <w:tcPr/>
+          <w:p>
+            <w:pPr>
+              <w:pStyle w:val="Compact"/>
+              <w:jc w:val="left"/>
+            </w:pPr>
+            <w:r>
+              <w:t xml:space="preserve">L:Q, Prüfungen</w:t>
+            </w:r>
+          </w:p>
+        </w:tc>
+      </w:tr>
+      <w:tr>
+        <w:trPr>
+          <w:cantSplit/>
+        </w:trPr>
+        <w:tc>
+          <w:tcPr/>
+          <w:p>
+            <w:pPr>
+              <w:pStyle w:val="Compact"/>
+              <w:jc w:val="left"/>
+            </w:pPr>
+            <w:r>
+              <w:t xml:space="preserve">Prüfkatalog</w:t>
+            </w:r>
+          </w:p>
+        </w:tc>
+        <w:tc>
+          <w:tcPr/>
+          <w:p>
+            <w:pPr>
+              <w:pStyle w:val="Compact"/>
+              <w:jc w:val="left"/>
+            </w:pPr>
+            <w:r>
+              <w:t xml:space="preserve">G:H (Kommentar/Bearbeitung)</w:t>
+            </w:r>
+          </w:p>
+        </w:tc>
+        <w:tc>
+          <w:tcPr/>
+          <w:p>
+            <w:pPr>
+              <w:pStyle w:val="Compact"/>
+              <w:jc w:val="left"/>
+            </w:pPr>
+            <w:r>
+              <w:t xml:space="preserve">A:F und I:J, fester Katalog und Berechnungen</w:t>
+            </w:r>
+          </w:p>
+        </w:tc>
+      </w:tr>
+    </w:tbl>
+    <w:p>
+      <w:pPr>
+        <w:pStyle w:val="BodyText"/>
+      </w:pPr>
+      <w:r>
+        <w:t xml:space="preserve">Bei «Berichte» wird der Auftrag in</w:t>
+      </w:r>
+      <w:r>
+        <w:t xml:space="preserve"> </w:t>
+      </w:r>
+      <w:r>
+        <w:rPr>
+          <w:b/>
+          <w:bCs/>
+        </w:rPr>
+        <w:t xml:space="preserve">B</w:t>
+      </w:r>
+      <w:r>
+        <w:t xml:space="preserve"> </w:t>
+      </w:r>
+      <w:r>
+        <w:t xml:space="preserve">ausgewählt.</w:t>
+      </w:r>
+      <w:r>
+        <w:t xml:space="preserve"> </w:t>
+      </w:r>
+      <w:r>
+        <w:rPr>
+          <w:b/>
+          <w:bCs/>
+        </w:rPr>
+        <w:t xml:space="preserve">H muss seine Formel behalten</w:t>
+      </w:r>
+      <w:r>
+        <w:t xml:space="preserve">;</w:t>
+      </w:r>
+      <w:r>
+        <w:t xml:space="preserve"> </w:t>
+      </w:r>
+      <w:r>
+        <w:t xml:space="preserve">der Import liest die berechnete Nummer aus H. Ein sichtbarer Auftrag in B genügt</w:t>
+      </w:r>
+      <w:r>
+        <w:t xml:space="preserve"> </w:t>
+      </w:r>
+      <w:r>
+        <w:t xml:space="preserve">nicht, wenn die Formel in H fehlt. Nach dem Anlegen einer Zeile kontrollieren, dass</w:t>
+      </w:r>
+      <w:r>
+        <w:t xml:space="preserve"> </w:t>
+      </w:r>
+      <w:r>
+        <w:t xml:space="preserve">Auftrag und berechnete Anzeigen erscheinen. Fehlt etwas, die Datei zur technischen</w:t>
+      </w:r>
+      <w:r>
+        <w:t xml:space="preserve"> </w:t>
+      </w:r>
+      <w:r>
+        <w:t xml:space="preserve">Prüfung an Stephan geben; keine Ersatzwerte in die Formelspalten schreiben.</w:t>
+      </w:r>
+    </w:p>
+    <w:p>
+      <w:pPr>
+        <w:pStyle w:val="BodyText"/>
+      </w:pPr>
+      <w:r>
+        <w:t xml:space="preserve">Neue Datensätze innerhalb der jeweiligen Excel-Tabelle anlegen und nur die</w:t>
+      </w:r>
+      <w:r>
+        <w:t xml:space="preserve"> </w:t>
+      </w:r>
+      <w:r>
+        <w:t xml:space="preserve">Eingabefelder füllen. Beim Übernehmen eines bestehenden Datensatzes nur die oben</w:t>
+      </w:r>
+      <w:r>
+        <w:t xml:space="preserve"> </w:t>
+      </w:r>
+      <w:r>
+        <w:t xml:space="preserve">genannten Eingabefelder als Werte kopieren, keine ganze Zeile und keinen ganzen</w:t>
+      </w:r>
+      <w:r>
+        <w:t xml:space="preserve"> </w:t>
+      </w:r>
+      <w:r>
+        <w:t xml:space="preserve">Blattbereich. In «Berichte» nur A:G kopieren, damit H erhalten bleibt.</w:t>
+      </w:r>
+      <w:r>
+        <w:t xml:space="preserve"> </w:t>
+      </w:r>
+      <w:r>
+        <w:t xml:space="preserve">Neue Nummern selbst vergeben und auf Eindeutigkeit prüfen.</w:t>
+      </w:r>
+    </w:p>
+    <w:p>
+      <w:pPr>
+        <w:pStyle w:val="BodyText"/>
+      </w:pPr>
+      <w:r>
+        <w:rPr>
+          <w:b/>
+          <w:bCs/>
+        </w:rPr>
+        <w:t xml:space="preserve">Keine ganzen Blattzeilen ausschneiden oder verschieben.</w:t>
+      </w:r>
+      <w:r>
+        <w:t xml:space="preserve"> </w:t>
+      </w:r>
+      <w:r>
+        <w:t xml:space="preserve">Einen Auftrag oder eine Betreuung fachlich über die vorgesehenen</w:t>
+      </w:r>
+      <w:r>
+        <w:t xml:space="preserve"> </w:t>
+      </w:r>
+      <w:r>
+        <w:t xml:space="preserve">Enddaten beenden. Muss ein irrtümlicher Datensatz oder eine Vertretungszuordnung</w:t>
+      </w:r>
+      <w:r>
+        <w:t xml:space="preserve"> </w:t>
+      </w:r>
+      <w:r>
+        <w:t xml:space="preserve">entfernt werden, vorher eine Dateikopie sichern und die Entfernung mit Stephan</w:t>
+      </w:r>
+      <w:r>
+        <w:t xml:space="preserve"> </w:t>
+      </w:r>
+      <w:r>
+        <w:t xml:space="preserve">abstimmen. Danach Formeln und Fehlerliste prüfen. Datensätze nur über die jeweilige</w:t>
+      </w:r>
+      <w:r>
+        <w:t xml:space="preserve"> </w:t>
+      </w:r>
+      <w:r>
+        <w:t xml:space="preserve">Excel-Tabelle entfernen; nach Strukturänderungen vor dem Import neu berechnen und prüfen.</w:t>
+      </w:r>
+    </w:p>
+    <w:p>
+      <w:pPr>
+        <w:pStyle w:val="BodyText"/>
+      </w:pPr>
+      <w:r>
+        <w:t xml:space="preserve">Beim Kundenstand vom 11.10.2026 enthalten die versteckten Zählspalten</w:t>
+      </w:r>
+      <w:r>
+        <w:t xml:space="preserve"> </w:t>
+      </w:r>
+      <w:r>
+        <w:rPr>
+          <w:b/>
+          <w:bCs/>
+        </w:rPr>
+        <w:t xml:space="preserve">Aufträge AP</w:t>
+      </w:r>
+      <w:r>
+        <w:t xml:space="preserve">,</w:t>
+      </w:r>
+      <w:r>
+        <w:t xml:space="preserve"> </w:t>
+      </w:r>
+      <w:r>
+        <w:rPr>
+          <w:b/>
+          <w:bCs/>
+        </w:rPr>
+        <w:t xml:space="preserve">Betreuungen AD</w:t>
+      </w:r>
+      <w:r>
+        <w:t xml:space="preserve"> </w:t>
+      </w:r>
+      <w:r>
+        <w:t xml:space="preserve">und</w:t>
+      </w:r>
+      <w:r>
+        <w:t xml:space="preserve"> </w:t>
+      </w:r>
+      <w:r>
+        <w:rPr>
+          <w:b/>
+          <w:bCs/>
+        </w:rPr>
+        <w:t xml:space="preserve">Berichte T</w:t>
+      </w:r>
+      <w:r>
+        <w:t xml:space="preserve"> </w:t>
+      </w:r>
+      <w:r>
+        <w:t xml:space="preserve">insgesamt 15 defekte Formeln. Sie verursachen</w:t>
+      </w:r>
+      <w:r>
+        <w:t xml:space="preserve"> </w:t>
+      </w:r>
+      <w:r>
+        <w:t xml:space="preserve">die Bezugsfehler in der «Fehlerliste». Solange dort</w:t>
+      </w:r>
+      <w:r>
+        <w:t xml:space="preserve"> </w:t>
+      </w:r>
+      <w:r>
+        <w:rPr>
+          <w:b/>
+          <w:bCs/>
+        </w:rPr>
+        <w:t xml:space="preserve">#BEZUG! / #REF!</w:t>
+      </w:r>
+      <w:r>
+        <w:t xml:space="preserve"> </w:t>
+      </w:r>
+      <w:r>
+        <w:t xml:space="preserve">steht, ist</w:t>
+      </w:r>
+      <w:r>
+        <w:t xml:space="preserve"> </w:t>
+      </w:r>
+      <w:r>
+        <w:t xml:space="preserve">die Fehlerliste unbrauchbar; das bedeutet nicht, dass die Daten fehlerfrei sind.</w:t>
+      </w:r>
+      <w:r>
+        <w:t xml:space="preserve"> </w:t>
+      </w:r>
+      <w:r>
+        <w:t xml:space="preserve">Datei sichern und Stephan informieren. Den Fehler weder mit Leerwerten noch mit</w:t>
+      </w:r>
+      <w:r>
+        <w:t xml:space="preserve"> </w:t>
+      </w:r>
+      <w:r>
+        <w:t xml:space="preserve">einer Formel unterdrücken. Reparatur und vollständige Neuberechnung in Excel sind</w:t>
+      </w:r>
+      <w:r>
+        <w:t xml:space="preserve"> </w:t>
+      </w:r>
+      <w:r>
+        <w:t xml:space="preserve">in der separat vorbereiteten Kundenkopie vom 12.10.2026 erfolgt. Die ursprüngliche</w:t>
+      </w:r>
+      <w:r>
+        <w:t xml:space="preserve"> </w:t>
+      </w:r>
+      <w:r>
+        <w:t xml:space="preserve">Datei unter import/ bleibt unverändert. Die Abnahme mit Windows Excel steht noch aus,</w:t>
+      </w:r>
+      <w:r>
+        <w:t xml:space="preserve"> </w:t>
+      </w:r>
+      <w:r>
+        <w:t xml:space="preserve">siehe</w:t>
+      </w:r>
+      <w:r>
+        <w:t xml:space="preserve"> </w:t>
+      </w:r>
+      <w:hyperlink r:id="rId24">
+        <w:r>
+          <w:rPr>
+            <w:rStyle w:val="Hyperlink"/>
+          </w:rPr>
+          <w:t xml:space="preserve">DM-80 im Backlog</w:t>
+        </w:r>
+      </w:hyperlink>
+      <w:r>
+        <w:t xml:space="preserve">.</w:t>
+      </w:r>
+    </w:p>
+    <w:p>
+      <w:pPr>
+        <w:pStyle w:val="BodyText"/>
+      </w:pPr>
+      <w:r>
+        <w:t xml:space="preserve">Kommentare werden in der vorbereiteten Kundenkopie im</w:t>
+      </w:r>
+      <w:r>
+        <w:t xml:space="preserve"> </w:t>
+      </w:r>
+      <w:r>
+        <w:rPr>
+          <w:b/>
+          <w:bCs/>
+        </w:rPr>
+        <w:t xml:space="preserve">Prüfkatalog, Spalte G</w:t>
+      </w:r>
+      <w:r>
+        <w:t xml:space="preserve"> </w:t>
+      </w:r>
+      <w:r>
+        <w:t xml:space="preserve">bei der festen Prüfung-ID gepflegt. Spalte H nimmt Bearbeitungsnotizen auf.</w:t>
+      </w:r>
+      <w:r>
+        <w:t xml:space="preserve"> </w:t>
+      </w:r>
+      <w:r>
+        <w:t xml:space="preserve">«Prüfungen», Spalte G, zeigt den Kommentar automatisch an; dort nicht hineinkopieren.</w:t>
+      </w:r>
+      <w:r>
+        <w:t xml:space="preserve"> </w:t>
+      </w:r>
+      <w:r>
+        <w:t xml:space="preserve">Die sechs bisherigen Kundenkommentare wurden den festen Prüfungen zugeordnet.</w:t>
+      </w:r>
+      <w:r>
+        <w:t xml:space="preserve"> </w:t>
+      </w:r>
+      <w:r>
+        <w:t xml:space="preserve">Die Fehlerliste verlinkt die betroffenen Eingabezeilen. Bei Rückmeldungen immer</w:t>
+      </w:r>
+      <w:r>
+        <w:t xml:space="preserve"> </w:t>
+      </w:r>
+      <w:r>
+        <w:t xml:space="preserve">Prüfung-ID und Datensatznummer nennen.</w:t>
+      </w:r>
+    </w:p>
+    <w:bookmarkStart w:id="25" w:name="X2497901b8aeae3d203bab7ec65776c9f8ffaa1c"/>
+    <w:p>
+      <w:pPr>
+        <w:pStyle w:val="Heading3"/>
+      </w:pPr>
+      <w:r>
+        <w:t xml:space="preserve">Bezugspersonen, Wohnorte und datierte Zuordnung MA</w:t>
+      </w:r>
+    </w:p>
+    <w:p>
+      <w:pPr>
+        <w:pStyle w:val="FirstParagraph"/>
+      </w:pPr>
+      <w:r>
+        <w:t xml:space="preserve">Eine erwachsene Person einmal in «Bezugspersonen» erfassen, mit eigener eindeutiger</w:t>
+      </w:r>
+      <w:r>
+        <w:t xml:space="preserve"> </w:t>
+      </w:r>
+      <w:r>
+        <w:t xml:space="preserve">Nummer, Namen, Wohnadresse, Telefon und E-Mail. In «Kind-Bezugsperson» wird diese</w:t>
+      </w:r>
+      <w:r>
+        <w:t xml:space="preserve"> </w:t>
+      </w:r>
+      <w:r>
+        <w:t xml:space="preserve">Nummer mit einem Kind verknüpft. Rolle und Sorgeberechtigung gelten je Verknüpfung;</w:t>
+      </w:r>
+      <w:r>
+        <w:t xml:space="preserve"> </w:t>
+      </w:r>
+      <w:r>
+        <w:t xml:space="preserve">dieselbe Person kann für mehrere Kinder unterschiedliche Rollen haben. Unbekannte</w:t>
+      </w:r>
+      <w:r>
+        <w:t xml:space="preserve"> </w:t>
+      </w:r>
+      <w:r>
+        <w:t xml:space="preserve">Sorgeberechtigung als «Unbekannt» erfassen. Das Feld «Familie» in «Kinder» bleibt</w:t>
+      </w:r>
+      <w:r>
+        <w:t xml:space="preserve"> </w:t>
+      </w:r>
+      <w:r>
+        <w:t xml:space="preserve">die bisherige Geschwisterkennung; eine gemeinsame Bezugsperson erzeugt keine Familie.</w:t>
+      </w:r>
+    </w:p>
+    <w:p>
+      <w:pPr>
+        <w:pStyle w:val="BodyText"/>
+      </w:pPr>
+      <w:r>
+        <w:t xml:space="preserve">Die aktuelle Wohnadresse des Kindes steht in «Kinder», N:Q. Ein Aufenthalt in</w:t>
+      </w:r>
+      <w:r>
+        <w:t xml:space="preserve"> </w:t>
+      </w:r>
+      <w:r>
+        <w:t xml:space="preserve">einer Einrichtung oder Pflegefamilie kann zusätzlich in «Platzierungen» erfasst</w:t>
+      </w:r>
+      <w:r>
+        <w:t xml:space="preserve"> </w:t>
+      </w:r>
+      <w:r>
+        <w:t xml:space="preserve">werden. Bekannte Zeiträume eintragen; fehlende alte Angaben bleiben leer. Wohnadresse</w:t>
+      </w:r>
+      <w:r>
+        <w:t xml:space="preserve"> </w:t>
+      </w:r>
+      <w:r>
+        <w:t xml:space="preserve">der Bezugsperson und Wohnadresse des Kindes sind getrennte Angaben.</w:t>
+      </w:r>
+    </w:p>
+    <w:p>
+      <w:pPr>
+        <w:pStyle w:val="BodyText"/>
+      </w:pPr>
+      <w:r>
+        <w:t xml:space="preserve">In «Zuordnung MA» je Auftrag, Mitarbeiter, Rolle und Zeitraum eine eigene Zeile</w:t>
+      </w:r>
+      <w:r>
+        <w:t xml:space="preserve"> </w:t>
+      </w:r>
+      <w:r>
+        <w:t xml:space="preserve">anlegen. Datumsgrenzen stehen in D:E. Beginn und Ende gelten einschliesslich. Für Berichte zählt die Fälligkeit:</w:t>
+      </w:r>
+      <w:r>
+        <w:t xml:space="preserve"> </w:t>
+      </w:r>
+      <w:r>
+        <w:t xml:space="preserve">ein am 31.07. endender P-Zeitraum ist für diesen Tag zuständig, der ab 01.08. beginnende</w:t>
+      </w:r>
+      <w:r>
+        <w:t xml:space="preserve"> </w:t>
+      </w:r>
+      <w:r>
+        <w:t xml:space="preserve">für spätere Fälligkeiten. P-Zeiträume dürfen sich nicht überschneiden. Ein leeres Ende</w:t>
+      </w:r>
+      <w:r>
+        <w:t xml:space="preserve"> </w:t>
+      </w:r>
+      <w:r>
+        <w:t xml:space="preserve">bedeutet fortlaufend; ein leerer Beginn bleibt unbekannt und begrenzt den Zeitraum</w:t>
+      </w:r>
+      <w:r>
+        <w:t xml:space="preserve"> </w:t>
+      </w:r>
+      <w:r>
+        <w:t xml:space="preserve">nicht nach hinten. Bisherige undatierte Zeilen gelten weiter und sind ausdrücklich</w:t>
+      </w:r>
+      <w:r>
+        <w:t xml:space="preserve"> </w:t>
+      </w:r>
+      <w:r>
+        <w:t xml:space="preserve">als historisch unbekannt gekennzeichnet. Beim ersten Wechsel auch die alte Zeile</w:t>
+      </w:r>
+      <w:r>
+        <w:t xml:space="preserve"> </w:t>
+      </w:r>
+      <w:r>
+        <w:t xml:space="preserve">mit einem Enddatum begrenzen. Historische Rollen und Zeilen nicht überschreiben</w:t>
+      </w:r>
+      <w:r>
+        <w:t xml:space="preserve"> </w:t>
+      </w:r>
+      <w:r>
+        <w:t xml:space="preserve">oder löschen. Die gemeinsame Tabelle dient Betreuung und Reporting.</w:t>
+      </w:r>
+    </w:p>
+    <w:p>
+      <w:pPr>
+        <w:pStyle w:val="BodyText"/>
+      </w:pPr>
+      <w:r>
+        <w:t xml:space="preserve">Erfassungsbögen werden für alle Zuordnungen erzeugt, die den Leistungsmonat berühren,</w:t>
+      </w:r>
+      <w:r>
+        <w:t xml:space="preserve"> </w:t>
+      </w:r>
+      <w:r>
+        <w:t xml:space="preserve">je Auftrag und Mitarbeiter einmal. Bei einem Wechsel innerhalb des Monats können</w:t>
+      </w:r>
+      <w:r>
+        <w:t xml:space="preserve"> </w:t>
+      </w:r>
+      <w:r>
+        <w:t xml:space="preserve">beide Mitarbeitenden einen Bogen erhalten. Vergangene oder erst künftig beginnende</w:t>
+      </w:r>
+      <w:r>
+        <w:t xml:space="preserve"> </w:t>
+      </w:r>
+      <w:r>
+        <w:t xml:space="preserve">Zuordnungen ausserhalb des Monats erzeugen keinen Bogen.</w:t>
+      </w:r>
+    </w:p>
+    <w:p>
+      <w:pPr>
+        <w:pStyle w:val="BodyText"/>
+      </w:pPr>
+      <w:r>
+        <w:t xml:space="preserve">Das Berichtsintervall erzeugt</w:t>
+      </w:r>
+      <w:r>
+        <w:t xml:space="preserve"> </w:t>
+      </w:r>
+      <w:r>
+        <w:rPr>
+          <w:b/>
+          <w:bCs/>
+        </w:rPr>
+        <w:t xml:space="preserve">keine</w:t>
+      </w:r>
+      <w:r>
+        <w:t xml:space="preserve"> </w:t>
+      </w:r>
+      <w:r>
+        <w:t xml:space="preserve">Berichtseinträge. Fälligkeiten müssen in</w:t>
+      </w:r>
+      <w:r>
+        <w:t xml:space="preserve"> </w:t>
+      </w:r>
+      <w:r>
+        <w:t xml:space="preserve">«Berichte» ausdrücklich eingetragen werden. Import und Reporting schreiben weder</w:t>
+      </w:r>
+      <w:r>
+        <w:t xml:space="preserve"> </w:t>
+      </w:r>
+      <w:r>
+        <w:t xml:space="preserve">Termine noch Zuständigkeiten in die Stammdatei zurück. Terminliste und Klientenübersicht</w:t>
+      </w:r>
+      <w:r>
+        <w:t xml:space="preserve"> </w:t>
+      </w:r>
+      <w:r>
+        <w:t xml:space="preserve">werden aus der aktuellen Stammdatei neu erzeugt; den Übersichtsreport nicht parallel</w:t>
+      </w:r>
+      <w:r>
+        <w:t xml:space="preserve"> </w:t>
+      </w:r>
+      <w:r>
+        <w:t xml:space="preserve">als zweite Datenquelle pflegen.</w:t>
+      </w:r>
+    </w:p>
+    <w:bookmarkEnd w:id="25"/>
+    <w:bookmarkEnd w:id="26"/>
+    <w:bookmarkStart w:id="27" w:name="einmalig-zu-tun"/>
     <w:p>
       <w:pPr>
         <w:pStyle w:val="Heading2"/>
@@ -393,7 +1464,24 @@
         <w:t xml:space="preserve"> </w:t>
       </w:r>
       <w:r>
-        <w:t xml:space="preserve">den Filter «prüfen» im «Prüfkatalog».</w:t>
+        <w:t xml:space="preserve">den Katalog rechts im Blatt «Prüfungen». Bei Bezugsfehlern zuerst den Abschnitt</w:t>
+      </w:r>
+      <w:r>
+        <w:t xml:space="preserve"> </w:t>
+      </w:r>
+      <w:hyperlink w:anchor="X57c913410347d03c820034936ffefd50e621294">
+        <w:r>
+          <w:rPr>
+            <w:rStyle w:val="Hyperlink"/>
+          </w:rPr>
+          <w:t xml:space="preserve">Formeln nicht bearbeiten</w:t>
+        </w:r>
+      </w:hyperlink>
+      <w:r>
+        <w:t xml:space="preserve"> </w:t>
+      </w:r>
+      <w:r>
+        <w:t xml:space="preserve">beachten.</w:t>
       </w:r>
     </w:p>
     <w:p>
@@ -455,7 +1543,7 @@
         <w:t xml:space="preserve"> </w:t>
       </w:r>
       <w:r>
-        <w:t xml:space="preserve">Sie bestimmen nur, wer die Berichte erstellen muss. Pro Auftrag genau eine Person mit P. Bei Aufträgen mit</w:t>
+        <w:t xml:space="preserve">Sie bestimmen, wer die Berichte erstellen muss. Pro Auftrag und Fälligkeitstag genau eine Person mit P. Bei Aufträgen mit</w:t>
       </w:r>
       <w:r>
         <w:t xml:space="preserve"> </w:t>
@@ -523,13 +1611,13 @@
         <w:t xml:space="preserve"> </w:t>
       </w:r>
       <w:r>
-        <w:t xml:space="preserve">Erledigt für Yahia, Nipote (Yarrah Orion) und Gorlov. Offen für Duarte Torres und Loosli:</w:t>
-      </w:r>
-      <w:r>
-        <w:t xml:space="preserve"> </w:t>
-      </w:r>
-      <w:r>
-        <w:t xml:space="preserve">Wegpiraten nennt das Ende des alten und den Beginn des neuen Auftrags.</w:t>
+        <w:t xml:space="preserve">Bereits überführte Folgeaufträge sind zur Prüfung markiert. Wo Zeiträume fehlen,</w:t>
+      </w:r>
+      <w:r>
+        <w:t xml:space="preserve"> </w:t>
+      </w:r>
+      <w:r>
+        <w:t xml:space="preserve">nennt Wegpiraten das Ende des alten und den Beginn des neuen Auftrags.</w:t>
       </w:r>
     </w:p>
     <w:p>
@@ -557,19 +1645,19 @@
         <w:t xml:space="preserve"> </w:t>
       </w:r>
       <w:r>
-        <w:t xml:space="preserve">ohne Datum gilt der 15. des Monats. Was von den Mitarbeiterblättern abweicht, steht in</w:t>
-      </w:r>
-      <w:r>
-        <w:t xml:space="preserve"> </w:t>
-      </w:r>
-      <w:r>
-        <w:rPr>
-          <w:rStyle w:val="VerbatimChar"/>
-        </w:rPr>
-        <w:t xml:space="preserve">sandbox/klaerung_berichte_2026-09-25.md</w:t>
-      </w:r>
-      <w:r>
-        <w:t xml:space="preserve">. Für vergangene Berichte fehlt der Status.</w:t>
+        <w:t xml:space="preserve">ohne Datum gilt der 15. des Monats. Abweichungen und aus dem Testbuild übernommene</w:t>
+      </w:r>
+      <w:r>
+        <w:t xml:space="preserve"> </w:t>
+      </w:r>
+      <w:r>
+        <w:t xml:space="preserve">Angaben sind in der Befundliste zur fachlichen Prüfung genannt. Für vergangene Berichte</w:t>
+      </w:r>
+      <w:r>
+        <w:t xml:space="preserve"> </w:t>
+      </w:r>
+      <w:r>
+        <w:t xml:space="preserve">fehlt der Status.</w:t>
       </w:r>
     </w:p>
     <w:p>
@@ -585,17 +1673,23 @@
           <w:b/>
           <w:bCs/>
         </w:rPr>
-        <w:t xml:space="preserve">Die offenen Fachfragen beantworten</w:t>
-      </w:r>
-      <w:r>
-        <w:t xml:space="preserve"> </w:t>
-      </w:r>
-      <w:r>
-        <w:t xml:space="preserve">(siehe Konzept, Abschnitt «Was offen ist»).</w:t>
-      </w:r>
-    </w:p>
-    <w:bookmarkEnd w:id="24"/>
-    <w:bookmarkStart w:id="27" w:name="bei-einem-ereignis-zu-pflegen"/>
+        <w:t xml:space="preserve">Die Befundliste zum finalen Workbook prüfen.</w:t>
+      </w:r>
+      <w:r>
+        <w:t xml:space="preserve"> </w:t>
+      </w:r>
+      <w:r>
+        <w:t xml:space="preserve">Technische Grundsatzfragen wurden</w:t>
+      </w:r>
+      <w:r>
+        <w:t xml:space="preserve"> </w:t>
+      </w:r>
+      <w:r>
+        <w:t xml:space="preserve">am 10.10.2026 beantwortet; Datenkorrekturen bleiben Aufgabe von Wegpiraten.</w:t>
+      </w:r>
+    </w:p>
+    <w:bookmarkEnd w:id="27"/>
+    <w:bookmarkStart w:id="33" w:name="bei-einem-ereignis-zu-pflegen"/>
     <w:p>
       <w:pPr>
         <w:pStyle w:val="Heading2"/>
@@ -636,6 +1730,7 @@
       <w:tr>
         <w:trPr>
           <w:tblHeader w:val="on"/>
+          <w:cantSplit/>
         </w:trPr>
         <w:tc>
           <w:tcPr/>
@@ -699,6 +1794,9 @@
         </w:tc>
       </w:tr>
       <w:tr>
+        <w:trPr>
+          <w:cantSplit/>
+        </w:trPr>
         <w:tc>
           <w:tcPr/>
           <w:p>
@@ -761,6 +1859,9 @@
         </w:tc>
       </w:tr>
       <w:tr>
+        <w:trPr>
+          <w:cantSplit/>
+        </w:trPr>
         <w:tc>
           <w:tcPr/>
           <w:p>
@@ -815,6 +1916,9 @@
         </w:tc>
       </w:tr>
       <w:tr>
+        <w:trPr>
+          <w:cantSplit/>
+        </w:trPr>
         <w:tc>
           <w:tcPr/>
           <w:p>
@@ -869,6 +1973,9 @@
         </w:tc>
       </w:tr>
       <w:tr>
+        <w:trPr>
+          <w:cantSplit/>
+        </w:trPr>
         <w:tc>
           <w:tcPr/>
           <w:p>
@@ -923,6 +2030,9 @@
         </w:tc>
       </w:tr>
       <w:tr>
+        <w:trPr>
+          <w:cantSplit/>
+        </w:trPr>
         <w:tc>
           <w:tcPr/>
           <w:p>
@@ -973,6 +2083,9 @@
         </w:tc>
       </w:tr>
       <w:tr>
+        <w:trPr>
+          <w:cantSplit/>
+        </w:trPr>
         <w:tc>
           <w:tcPr/>
           <w:p>
@@ -1027,6 +2140,9 @@
         </w:tc>
       </w:tr>
       <w:tr>
+        <w:trPr>
+          <w:cantSplit/>
+        </w:trPr>
         <w:tc>
           <w:tcPr/>
           <w:p>
@@ -1085,6 +2201,9 @@
         </w:tc>
       </w:tr>
       <w:tr>
+        <w:trPr>
+          <w:cantSplit/>
+        </w:trPr>
         <w:tc>
           <w:tcPr/>
           <w:p>
@@ -1147,6 +2266,9 @@
         </w:tc>
       </w:tr>
       <w:tr>
+        <w:trPr>
+          <w:cantSplit/>
+        </w:trPr>
         <w:tc>
           <w:tcPr/>
           <w:p>
@@ -1191,12 +2313,15 @@
               <w:jc w:val="left"/>
             </w:pPr>
             <w:r>
-              <w:t xml:space="preserve">Zeile in «Zuordnung MA» ergänzen, danach entfernen</w:t>
+              <w:t xml:space="preserve">S-Zeile in «Zuordnung MA» mit Beginn/Ende ergänzen und historisch behalten</w:t>
             </w:r>
           </w:p>
         </w:tc>
       </w:tr>
       <w:tr>
+        <w:trPr>
+          <w:cantSplit/>
+        </w:trPr>
         <w:tc>
           <w:tcPr/>
           <w:p>
@@ -1247,6 +2372,9 @@
         </w:tc>
       </w:tr>
       <w:tr>
+        <w:trPr>
+          <w:cantSplit/>
+        </w:trPr>
         <w:tc>
           <w:tcPr/>
           <w:p>
@@ -1297,6 +2425,9 @@
         </w:tc>
       </w:tr>
       <w:tr>
+        <w:trPr>
+          <w:cantSplit/>
+        </w:trPr>
         <w:tc>
           <w:tcPr/>
           <w:p>
@@ -1347,6 +2478,9 @@
         </w:tc>
       </w:tr>
       <w:tr>
+        <w:trPr>
+          <w:cantSplit/>
+        </w:trPr>
         <w:tc>
           <w:tcPr/>
           <w:p>
@@ -1397,6 +2531,9 @@
         </w:tc>
       </w:tr>
       <w:tr>
+        <w:trPr>
+          <w:cantSplit/>
+        </w:trPr>
         <w:tc>
           <w:tcPr/>
           <w:p>
@@ -1466,8 +2603,599 @@
       <w:r>
         <w:t xml:space="preserve">entfernen, sonst entsteht ein Bogen ohne Stunden.</w:t>
       </w:r>
-    </w:p>
-    <w:bookmarkStart w:id="25" w:name="typische-vorgänge"/>
+      <w:r>
+        <w:t xml:space="preserve"> </w:t>
+      </w:r>
+      <w:r>
+        <w:t xml:space="preserve">Bis zur Formelreparatur gilt dafür das oben beschriebene Vorgehen für das Entfernen</w:t>
+      </w:r>
+      <w:r>
+        <w:t xml:space="preserve"> </w:t>
+      </w:r>
+      <w:r>
+        <w:t xml:space="preserve">von Zuordnungen; keine ganze Blattzeile löschen.</w:t>
+      </w:r>
+    </w:p>
+    <w:bookmarkStart w:id="28" w:name="monatliche-terminlisten-für-berichte"/>
+    <w:p>
+      <w:pPr>
+        <w:pStyle w:val="Heading3"/>
+      </w:pPr>
+      <w:r>
+        <w:t xml:space="preserve">Monatliche Terminlisten für Berichte</w:t>
+      </w:r>
+    </w:p>
+    <w:p>
+      <w:pPr>
+        <w:pStyle w:val="FirstParagraph"/>
+      </w:pPr>
+      <w:r>
+        <w:t xml:space="preserve">Nach Änderungen im Workbook die Arbeitsdatenbank wie im Betriebsworkflow neu aufsetzen</w:t>
+      </w:r>
+      <w:r>
+        <w:t xml:space="preserve"> </w:t>
+      </w:r>
+      <w:r>
+        <w:t xml:space="preserve">und die Stammdaten importieren. Danach die Terminlisten für den gewünschten Monat erstellen:</w:t>
+      </w:r>
+    </w:p>
+    <w:p>
+      <w:pPr>
+        <w:pStyle w:val="SourceCode"/>
+      </w:pPr>
+      <w:r>
+        <w:rPr>
+          <w:rStyle w:val="FunctionTok"/>
+        </w:rPr>
+        <w:t xml:space="preserve">make</w:t>
+      </w:r>
+      <w:r>
+        <w:rPr>
+          <w:rStyle w:val="NormalTok"/>
+        </w:rPr>
+        <w:t xml:space="preserve"> terminliste MONTH=2026-10</w:t>
+      </w:r>
+    </w:p>
+    <w:p>
+      <w:pPr>
+        <w:pStyle w:val="FirstParagraph"/>
+      </w:pPr>
+      <w:r>
+        <w:t xml:space="preserve">Im konfigurierten Ausgabeverzeichnis entsteht der Ordner</w:t>
+      </w:r>
+      <w:r>
+        <w:t xml:space="preserve"> </w:t>
+      </w:r>
+      <w:r>
+        <w:rPr>
+          <w:rStyle w:val="VerbatimChar"/>
+        </w:rPr>
+        <w:t xml:space="preserve">Terminlisten_2026-10</w:t>
+      </w:r>
+      <w:r>
+        <w:t xml:space="preserve">, mit</w:t>
+      </w:r>
+      <w:r>
+        <w:t xml:space="preserve"> </w:t>
+      </w:r>
+      <w:r>
+        <w:rPr>
+          <w:rStyle w:val="VerbatimChar"/>
+        </w:rPr>
+        <w:t xml:space="preserve">Terminliste_2026-10_&lt;MA-ID&gt;.xlsx</w:t>
+      </w:r>
+      <w:r>
+        <w:t xml:space="preserve"> </w:t>
+      </w:r>
+      <w:r>
+        <w:t xml:space="preserve">je Mitarbeitenden. Auch Mitarbeitende ohne fällige Berichte</w:t>
+      </w:r>
+      <w:r>
+        <w:t xml:space="preserve"> </w:t>
+      </w:r>
+      <w:r>
+        <w:t xml:space="preserve">bekommen eine Datei mit entsprechendem Hinweis. Der Timesheet-Schalter hat keinen Einfluss.</w:t>
+      </w:r>
+      <w:r>
+        <w:t xml:space="preserve"> </w:t>
+      </w:r>
+      <w:r>
+        <w:t xml:space="preserve">Die Erstellung läuft separat von den Zeiterfassungsbögen.</w:t>
+      </w:r>
+    </w:p>
+    <w:p>
+      <w:pPr>
+        <w:pStyle w:val="BodyText"/>
+      </w:pPr>
+      <w:r>
+        <w:t xml:space="preserve">Aufgenommen werden Berichte mit «Fällig am» im gewählten Monat, ausser mit Status «erledigt»</w:t>
+      </w:r>
+      <w:r>
+        <w:t xml:space="preserve"> </w:t>
+      </w:r>
+      <w:r>
+        <w:t xml:space="preserve">oder «entfällt». Auch Einträge ohne Status werden aufgenommen. Die Liste zeigt Fälligkeit,</w:t>
+      </w:r>
+      <w:r>
+        <w:t xml:space="preserve"> </w:t>
+      </w:r>
+      <w:r>
+        <w:t xml:space="preserve">Auftrag, Indexkind, Leistungsart, Leistungsbesteller, Berichtsform, Status, Notizen und Bericht-ID,</w:t>
+      </w:r>
+      <w:r>
+        <w:t xml:space="preserve"> </w:t>
+      </w:r>
+      <w:r>
+        <w:t xml:space="preserve">sortiert nach Fälligkeit und Auftrag. Berichtsformen sind Text; Rhythmen erzeugen keine Termine.</w:t>
+      </w:r>
+      <w:r>
+        <w:t xml:space="preserve"> </w:t>
+      </w:r>
+      <w:r>
+        <w:t xml:space="preserve">Auch Berichte nach dem Ende eines Auftrags können fällig sein.</w:t>
+      </w:r>
+    </w:p>
+    <w:p>
+      <w:pPr>
+        <w:pStyle w:val="BodyText"/>
+      </w:pPr>
+      <w:r>
+        <w:t xml:space="preserve">Zuständig ist die Person mit Rolle P am</w:t>
+      </w:r>
+      <w:r>
+        <w:t xml:space="preserve"> </w:t>
+      </w:r>
+      <w:r>
+        <w:rPr>
+          <w:b/>
+          <w:bCs/>
+        </w:rPr>
+        <w:t xml:space="preserve">Fälligkeitstag</w:t>
+      </w:r>
+      <w:r>
+        <w:t xml:space="preserve"> </w:t>
+      </w:r>
+      <w:r>
+        <w:t xml:space="preserve">aus «Zuordnung MA».</w:t>
+      </w:r>
+      <w:r>
+        <w:t xml:space="preserve"> </w:t>
+      </w:r>
+      <w:r>
+        <w:t xml:space="preserve">Ohne Datumsgrenzen bleibt die bisherige Zuordnung gültig; die Ausgabe kennzeichnet</w:t>
+      </w:r>
+      <w:r>
+        <w:t xml:space="preserve"> </w:t>
+      </w:r>
+      <w:r>
+        <w:t xml:space="preserve">die historische Zuständigkeit als unbekannt. Eine Lücke, Überschneidung oder ungültige</w:t>
+      </w:r>
+      <w:r>
+        <w:t xml:space="preserve"> </w:t>
+      </w:r>
+      <w:r>
+        <w:t xml:space="preserve">Datumsangabe führt zu einem Befund; es wird keine andere Person ersatzweise gewählt.</w:t>
+      </w:r>
+      <w:r>
+        <w:t xml:space="preserve"> </w:t>
+      </w:r>
+      <w:r>
+        <w:t xml:space="preserve">Fehlt eine zuständige Person, meldet das Log den</w:t>
+      </w:r>
+      <w:r>
+        <w:t xml:space="preserve"> </w:t>
+      </w:r>
+      <w:r>
+        <w:t xml:space="preserve">Bericht und Auftrag als Warnung; der Eintrag wird ausgelassen und der Export läuft weiter.</w:t>
+      </w:r>
+      <w:r>
+        <w:t xml:space="preserve"> </w:t>
+      </w:r>
+      <w:r>
+        <w:t xml:space="preserve">Dasselbe gilt bei mehreren P, einem fehlenden Auftrag oder einer fehlenden Person in den</w:t>
+      </w:r>
+      <w:r>
+        <w:t xml:space="preserve"> </w:t>
+      </w:r>
+      <w:r>
+        <w:t xml:space="preserve">Mitarbeiter-Stammdaten. Solche Befunde im Workbook korrigieren, die Arbeitsdatenbank neu</w:t>
+      </w:r>
+      <w:r>
+        <w:t xml:space="preserve"> </w:t>
+      </w:r>
+      <w:r>
+        <w:t xml:space="preserve">aufsetzen und die Listen erneut erzeugen. Ein erneuter Lauf überschreibt die Dateien dieser</w:t>
+      </w:r>
+      <w:r>
+        <w:t xml:space="preserve"> </w:t>
+      </w:r>
+      <w:r>
+        <w:t xml:space="preserve">Mitarbeitenden für denselben Monat.</w:t>
+      </w:r>
+    </w:p>
+    <w:bookmarkEnd w:id="28"/>
+    <w:bookmarkStart w:id="29" w:name="zuordnung-ma-mit-zeiträumen-pflegen"/>
+    <w:p>
+      <w:pPr>
+        <w:pStyle w:val="Heading3"/>
+      </w:pPr>
+      <w:r>
+        <w:t xml:space="preserve">Zuordnung MA mit Zeiträumen pflegen</w:t>
+      </w:r>
+    </w:p>
+    <w:p>
+      <w:pPr>
+        <w:pStyle w:val="FirstParagraph"/>
+      </w:pPr>
+      <w:r>
+        <w:t xml:space="preserve">Die bestehende Excel-Tabelle</w:t>
+      </w:r>
+      <w:r>
+        <w:t xml:space="preserve"> </w:t>
+      </w:r>
+      <w:r>
+        <w:rPr>
+          <w:rStyle w:val="VerbatimChar"/>
+          <w:b/>
+          <w:bCs/>
+        </w:rPr>
+        <w:t xml:space="preserve">relation_mandate_emp</w:t>
+      </w:r>
+      <w:r>
+        <w:t xml:space="preserve"> </w:t>
+      </w:r>
+      <w:r>
+        <w:t xml:space="preserve">im Blatt «Zuordnung MA»</w:t>
+      </w:r>
+      <w:r>
+        <w:t xml:space="preserve"> </w:t>
+      </w:r>
+      <w:r>
+        <w:t xml:space="preserve">bleibt die einzige Zuordnungsquelle. Eingaben stehen in A:E: Auftrag,</w:t>
+      </w:r>
+      <w:r>
+        <w:t xml:space="preserve"> </w:t>
+      </w:r>
+      <w:r>
+        <w:t xml:space="preserve">Mitarbeiter, Rolle,</w:t>
+      </w:r>
+      <w:r>
+        <w:t xml:space="preserve"> </w:t>
+      </w:r>
+      <w:r>
+        <w:rPr>
+          <w:rStyle w:val="VerbatimChar"/>
+        </w:rPr>
+        <w:t xml:space="preserve">valid_from</w:t>
+      </w:r>
+      <w:r>
+        <w:t xml:space="preserve"> </w:t>
+      </w:r>
+      <w:r>
+        <w:t xml:space="preserve">und</w:t>
+      </w:r>
+      <w:r>
+        <w:t xml:space="preserve"> </w:t>
+      </w:r>
+      <w:r>
+        <w:rPr>
+          <w:rStyle w:val="VerbatimChar"/>
+        </w:rPr>
+        <w:t xml:space="preserve">valid_to</w:t>
+      </w:r>
+      <w:r>
+        <w:t xml:space="preserve">. Datumsfelder als echte Excel-Daten</w:t>
+      </w:r>
+      <w:r>
+        <w:t xml:space="preserve"> </w:t>
+      </w:r>
+      <w:r>
+        <w:t xml:space="preserve">erfassen. Offene Grenzen dürfen leer bleiben. Beide Grenzen zählen mit. P bezeichnet</w:t>
+      </w:r>
+      <w:r>
+        <w:t xml:space="preserve"> </w:t>
+      </w:r>
+      <w:r>
+        <w:t xml:space="preserve">die Berichtszuständigkeit, S eine Unterstützung. Zwei P-Zeiträume desselben Auftrags</w:t>
+      </w:r>
+      <w:r>
+        <w:t xml:space="preserve"> </w:t>
+      </w:r>
+      <w:r>
+        <w:t xml:space="preserve">dürfen sich nicht überschneiden. Wiederkehrende Mitarbeiter erhalten weitere Zeilen</w:t>
+      </w:r>
+      <w:r>
+        <w:t xml:space="preserve"> </w:t>
+      </w:r>
+      <w:r>
+        <w:t xml:space="preserve">mit den jeweiligen Zeiträumen. Für einen Wechsel die alte Zeile beenden und eine</w:t>
+      </w:r>
+      <w:r>
+        <w:t xml:space="preserve"> </w:t>
+      </w:r>
+      <w:r>
+        <w:t xml:space="preserve">neue anlegen; die alte Rolle nicht nachträglich auf S ändern.</w:t>
+      </w:r>
+    </w:p>
+    <w:p>
+      <w:pPr>
+        <w:pStyle w:val="BodyText"/>
+      </w:pPr>
+      <w:r>
+        <w:t xml:space="preserve">Beispiel: M0567 ist für A26123 vom 01.01.2026 bis 31.07.2026 zuständig, M0123 vom</w:t>
+      </w:r>
+      <w:r>
+        <w:t xml:space="preserve"> </w:t>
+      </w:r>
+      <w:r>
+        <w:t xml:space="preserve">01.08.2026 bis 31.12.2026, M0789 ab 01.01.2027. Der im Oktober fällige Bericht</w:t>
+      </w:r>
+      <w:r>
+        <w:t xml:space="preserve"> </w:t>
+      </w:r>
+      <w:r>
+        <w:t xml:space="preserve">erscheint bei M0123. Eine spätere Erledigung ändert diese Zuordnung nicht.</w:t>
+      </w:r>
+      <w:r>
+        <w:t xml:space="preserve"> </w:t>
+      </w:r>
+      <w:r>
+        <w:t xml:space="preserve">Bei einem Folgeauftrag dessen eigene A-Nummer in den neuen Zeiträumen verwenden.</w:t>
+      </w:r>
+    </w:p>
+    <w:p>
+      <w:pPr>
+        <w:pStyle w:val="BodyText"/>
+      </w:pPr>
+      <w:r>
+        <w:t xml:space="preserve">Abgeschlossene Zeiträume in der Mappe behalten. Nach jedem DB-Neuaufbau liest der</w:t>
+      </w:r>
+      <w:r>
+        <w:t xml:space="preserve"> </w:t>
+      </w:r>
+      <w:r>
+        <w:t xml:space="preserve">Import sie erneut ein; Terminlisten und Klientenübersicht berechnen daraus die</w:t>
+      </w:r>
+      <w:r>
+        <w:t xml:space="preserve"> </w:t>
+      </w:r>
+      <w:r>
+        <w:t xml:space="preserve">Zuständigkeit. Sie schreiben diese weder in die Kundenmappe zurück noch erzeugen</w:t>
+      </w:r>
+      <w:r>
+        <w:t xml:space="preserve"> </w:t>
+      </w:r>
+      <w:r>
+        <w:t xml:space="preserve">sie zusätzliche Berichtstermine. Alte Mappen ohne die neuen Datumsspalten bleiben</w:t>
+      </w:r>
+      <w:r>
+        <w:t xml:space="preserve"> </w:t>
+      </w:r>
+      <w:r>
+        <w:t xml:space="preserve">importierbar; ihre Zuordnungen gelten ohne Datumsgrenzen. Ein separates Blatt</w:t>
+      </w:r>
+      <w:r>
+        <w:t xml:space="preserve"> </w:t>
+      </w:r>
+      <w:r>
+        <w:t xml:space="preserve">«Zuständigkeitsverlauf» wird nicht mehr verwendet.</w:t>
+      </w:r>
+    </w:p>
+    <w:bookmarkEnd w:id="29"/>
+    <w:bookmarkStart w:id="30" w:name="klientenübersicht-neu-erzeugen"/>
+    <w:p>
+      <w:pPr>
+        <w:pStyle w:val="Heading3"/>
+      </w:pPr>
+      <w:r>
+        <w:t xml:space="preserve">Klientenübersicht neu erzeugen</w:t>
+      </w:r>
+    </w:p>
+    <w:p>
+      <w:pPr>
+        <w:pStyle w:val="SourceCode"/>
+      </w:pPr>
+      <w:r>
+        <w:rPr>
+          <w:rStyle w:val="FunctionTok"/>
+        </w:rPr>
+        <w:t xml:space="preserve">make</w:t>
+      </w:r>
+      <w:r>
+        <w:rPr>
+          <w:rStyle w:val="NormalTok"/>
+        </w:rPr>
+        <w:t xml:space="preserve"> klientenuebersicht MONTH=2026-10</w:t>
+      </w:r>
+    </w:p>
+    <w:p>
+      <w:pPr>
+        <w:pStyle w:val="FirstParagraph"/>
+      </w:pPr>
+      <w:r>
+        <w:t xml:space="preserve">Im konfigurierten Output entsteht</w:t>
+      </w:r>
+      <w:r>
+        <w:t xml:space="preserve"> </w:t>
+      </w:r>
+      <w:r>
+        <w:rPr>
+          <w:rStyle w:val="VerbatimChar"/>
+        </w:rPr>
+        <w:t xml:space="preserve">Klientenuebersichten_2026-10/Klientenuebersicht_2026-10.xlsx</w:t>
+      </w:r>
+      <w:r>
+        <w:t xml:space="preserve">. Die Mappe enthält</w:t>
+      </w:r>
+      <w:r>
+        <w:t xml:space="preserve"> </w:t>
+      </w:r>
+      <w:r>
+        <w:t xml:space="preserve">eine Legende vor den Mitarbeiterblättern, das Monatsraster für 2026 und 2027,</w:t>
+      </w:r>
+      <w:r>
+        <w:t xml:space="preserve"> </w:t>
+      </w:r>
+      <w:r>
+        <w:t xml:space="preserve">«Berichtsdetails» und «Nicht zugeordnet». Ein Sammelblatt «Übersicht» gibt es nicht.</w:t>
+      </w:r>
+      <w:r>
+        <w:t xml:space="preserve"> </w:t>
+      </w:r>
+      <w:r>
+        <w:t xml:space="preserve">Die mehrfachen Vor-/Nachnamensspalten der alten Datei entfallen.</w:t>
+      </w:r>
+    </w:p>
+    <w:p>
+      <w:pPr>
+        <w:pStyle w:val="BodyText"/>
+      </w:pPr>
+      <w:r>
+        <w:t xml:space="preserve">Eine Zeile entspricht einem ausdrücklich genannten Auftrag mit Berichtsterminen</w:t>
+      </w:r>
+      <w:r>
+        <w:t xml:space="preserve"> </w:t>
+      </w:r>
+      <w:r>
+        <w:t xml:space="preserve">im Raster. Folgeaufträge und parallele Leistungen bleiben getrennt. Termine werden</w:t>
+      </w:r>
+      <w:r>
+        <w:t xml:space="preserve"> </w:t>
+      </w:r>
+      <w:r>
+        <w:t xml:space="preserve">nach Fälligkeit zugeordnet; alle Statuswerte bleiben sichtbar. Mehrere Termine in</w:t>
+      </w:r>
+      <w:r>
+        <w:t xml:space="preserve"> </w:t>
+      </w:r>
+      <w:r>
+        <w:t xml:space="preserve">einem Monat stehen einzeln mit Datum, Form, Bericht-ID und Status in der Zelle.</w:t>
+      </w:r>
+      <w:r>
+        <w:t xml:space="preserve"> </w:t>
+      </w:r>
+      <w:r>
+        <w:t xml:space="preserve">Rot bedeutet Bericht, Orange Zwischenbericht, Blau Abschlussbericht. Bei gemischten</w:t>
+      </w:r>
+      <w:r>
+        <w:t xml:space="preserve"> </w:t>
+      </w:r>
+      <w:r>
+        <w:t xml:space="preserve">Berichtsformen ist die Zelle grau. «Berichtsdetails» enthält jeden importierten</w:t>
+      </w:r>
+      <w:r>
+        <w:t xml:space="preserve"> </w:t>
+      </w:r>
+      <w:r>
+        <w:t xml:space="preserve">Bericht genau einmal; fehlende Zuordnungen und Termine ausserhalb des Rasters</w:t>
+      </w:r>
+      <w:r>
+        <w:t xml:space="preserve"> </w:t>
+      </w:r>
+      <w:r>
+        <w:t xml:space="preserve">erscheinen zusätzlich unter «Nicht zugeordnet».</w:t>
+      </w:r>
+    </w:p>
+    <w:p>
+      <w:pPr>
+        <w:pStyle w:val="BodyText"/>
+      </w:pPr>
+      <w:r>
+        <w:t xml:space="preserve">G:N zeigen den aktuellen</w:t>
+      </w:r>
+      <w:r>
+        <w:t xml:space="preserve"> </w:t>
+      </w:r>
+      <w:r>
+        <w:rPr>
+          <w:b/>
+          <w:bCs/>
+        </w:rPr>
+        <w:t xml:space="preserve">importierten Stand des angezeigten Auftrags</w:t>
+      </w:r>
+      <w:r>
+        <w:t xml:space="preserve">:</w:t>
+      </w:r>
+      <w:r>
+        <w:t xml:space="preserve"> </w:t>
+      </w:r>
+      <w:r>
+        <w:t xml:space="preserve">Bewilligungsbeginn/-ende, operative MA-Zuordnung, Kontingente in Stunden pro Monat</w:t>
+      </w:r>
+      <w:r>
+        <w:t xml:space="preserve"> </w:t>
+      </w:r>
+      <w:r>
+        <w:t xml:space="preserve">und Leistungsart. Diese Angaben belegen keinen früheren Auftragsstand. Die heutige</w:t>
+      </w:r>
+      <w:r>
+        <w:t xml:space="preserve"> </w:t>
+      </w:r>
+      <w:r>
+        <w:t xml:space="preserve">MA-Zuordnung in I kann von der datierten Berichtszuständigkeit abweichen.</w:t>
+      </w:r>
+      <w:r>
+        <w:t xml:space="preserve"> </w:t>
+      </w:r>
+      <w:r>
+        <w:t xml:space="preserve">Die Telefonnummer kommt aus dem optionalen Feld</w:t>
+      </w:r>
+      <w:r>
+        <w:t xml:space="preserve"> </w:t>
+      </w:r>
+      <w:r>
+        <w:rPr>
+          <w:rStyle w:val="VerbatimChar"/>
+        </w:rPr>
+        <w:t xml:space="preserve">phone</w:t>
+      </w:r>
+      <w:r>
+        <w:t xml:space="preserve"> </w:t>
+      </w:r>
+      <w:r>
+        <w:t xml:space="preserve">bei Ansprechpersonen.</w:t>
+      </w:r>
+    </w:p>
+    <w:p>
+      <w:pPr>
+        <w:pStyle w:val="BodyText"/>
+      </w:pPr>
+      <w:r>
+        <w:t xml:space="preserve">Die Ausgabe jeden Monat neu erzeugen. Fachliche Änderungen ausschliesslich in der</w:t>
+      </w:r>
+      <w:r>
+        <w:t xml:space="preserve"> </w:t>
+      </w:r>
+      <w:r>
+        <w:t xml:space="preserve">Stammdatenmappe pflegen, neu importieren und die Ausgabe erneut erstellen; keine</w:t>
+      </w:r>
+      <w:r>
+        <w:t xml:space="preserve"> </w:t>
+      </w:r>
+      <w:r>
+        <w:t xml:space="preserve">manuell weitergeführte Kopie als zweite Datenquelle. Vor dem nächsten Kundenimport</w:t>
+      </w:r>
+      <w:r>
+        <w:t xml:space="preserve"> </w:t>
+      </w:r>
+      <w:r>
+        <w:t xml:space="preserve">prüft der Agent die gesamte aktuelle Stammdatenmappe. Offene Datenfehler dürfen</w:t>
+      </w:r>
+      <w:r>
+        <w:t xml:space="preserve"> </w:t>
+      </w:r>
+      <w:r>
+        <w:t xml:space="preserve">diesen Import weiterhin scheitern lassen. Zeilen und Spalten sind im Export</w:t>
+      </w:r>
+      <w:r>
+        <w:t xml:space="preserve"> </w:t>
+      </w:r>
+      <w:r>
+        <w:t xml:space="preserve">bereits fixiert; das Monatsraster beginnt nach den Stammdaten in O.</w:t>
+      </w:r>
+    </w:p>
+    <w:bookmarkEnd w:id="30"/>
+    <w:bookmarkStart w:id="31" w:name="typische-vorgänge"/>
     <w:p>
       <w:pPr>
         <w:pStyle w:val="Heading3"/>
@@ -1685,7 +3413,7 @@
         <w:t xml:space="preserve"> </w:t>
       </w:r>
       <w:r>
-        <w:t xml:space="preserve">bekommt die Rolle P.</w:t>
+        <w:t xml:space="preserve">bekommt die Rolle P. Bekannten Beginn in P eintragen, Ende in Q, falls bekannt.</w:t>
       </w:r>
     </w:p>
     <w:p>
@@ -1733,13 +3461,19 @@
         </w:numPr>
       </w:pPr>
       <w:r>
-        <w:t xml:space="preserve">Im Blatt «Aufträge» die Zeile des bisherigen Auftrags kopieren und darunter einfügen. Die</w:t>
-      </w:r>
-      <w:r>
-        <w:t xml:space="preserve"> </w:t>
-      </w:r>
-      <w:r>
-        <w:t xml:space="preserve">alte Zeile bleibt unverändert, auch «Bewilligung bis».</w:t>
+        <w:t xml:space="preserve">Im Blatt «Aufträge» eine neue Tabellenzeile anlegen und nur die Eingabefelder A:Q</w:t>
+      </w:r>
+      <w:r>
+        <w:t xml:space="preserve"> </w:t>
+      </w:r>
+      <w:r>
+        <w:t xml:space="preserve">des bisherigen Auftrags als Werte übernehmen. Keine ganze Blattzeile kopieren.</w:t>
+      </w:r>
+      <w:r>
+        <w:t xml:space="preserve"> </w:t>
+      </w:r>
+      <w:r>
+        <w:t xml:space="preserve">Die alte Zeile bleibt unverändert, auch «Bewilligung bis».</w:t>
       </w:r>
     </w:p>
     <w:p>
@@ -1781,13 +3515,19 @@
         </w:numPr>
       </w:pPr>
       <w:r>
-        <w:t xml:space="preserve">Im Blatt «Betreuungen» die Zeilen des alten Auftrags kopieren und nur die Auftrag-Nr</w:t>
-      </w:r>
-      <w:r>
-        <w:t xml:space="preserve"> </w:t>
-      </w:r>
-      <w:r>
-        <w:t xml:space="preserve">ändern. Der Eintritt bleibt gleich, der Austritt leer.</w:t>
+        <w:t xml:space="preserve">Im Blatt «Betreuungen» neue Tabellenzeilen anlegen und nur die Eingabefelder A:L</w:t>
+      </w:r>
+      <w:r>
+        <w:t xml:space="preserve"> </w:t>
+      </w:r>
+      <w:r>
+        <w:t xml:space="preserve">der bisherigen Betreuungen als Werte übernehmen. Auftrag-Nr ändern, Eintritt</w:t>
+      </w:r>
+      <w:r>
+        <w:t xml:space="preserve"> </w:t>
+      </w:r>
+      <w:r>
+        <w:t xml:space="preserve">beibehalten und Austritt leeren. Die Formelspalten bleiben erhalten.</w:t>
       </w:r>
     </w:p>
     <w:p>
@@ -1799,7 +3539,19 @@
         </w:numPr>
       </w:pPr>
       <w:r>
-        <w:t xml:space="preserve">Im Blatt «Zuordnung MA» die Zeilen kopieren und die Auftrag-Nr ändern. Die Rollen bleiben.</w:t>
+        <w:t xml:space="preserve">Im Blatt «Zuordnung MA» neue Tabellenzeilen anlegen, nur A:C als Werte übernehmen</w:t>
+      </w:r>
+      <w:r>
+        <w:t xml:space="preserve"> </w:t>
+      </w:r>
+      <w:r>
+        <w:t xml:space="preserve">und die Auftrag-Nr ändern. Die Rollen bleiben; D:E für den neuen Auftrag neu</w:t>
+      </w:r>
+      <w:r>
+        <w:t xml:space="preserve"> </w:t>
+      </w:r>
+      <w:r>
+        <w:t xml:space="preserve">festlegen und keine alten Enddaten blind kopieren.</w:t>
       </w:r>
     </w:p>
     <w:p>
@@ -1967,7 +3719,19 @@
         </w:numPr>
       </w:pPr>
       <w:r>
-        <w:t xml:space="preserve">Die Zeilen in «Zuordnung MA» entfernen, sonst entstehen weiter Erfassungsbögen.</w:t>
+        <w:t xml:space="preserve">Die Zuordnungen in «Zuordnung MA» prüfen und mit «Gültig bis» beenden. Die Zeilen</w:t>
+      </w:r>
+      <w:r>
+        <w:t xml:space="preserve"> </w:t>
+      </w:r>
+      <w:r>
+        <w:t xml:space="preserve">bleiben zur historischen Zuordnung erhalten.</w:t>
+      </w:r>
+      <w:r>
+        <w:t xml:space="preserve"> </w:t>
+      </w:r>
+      <w:r>
+        <w:t xml:space="preserve">Abgelaufene Bewilligungen werden bei der Bogenerzeugung bereits berücksichtigt.</w:t>
       </w:r>
     </w:p>
     <w:p>
@@ -1987,11 +3751,17 @@
         <w:pStyle w:val="BodyText"/>
       </w:pPr>
       <w:r>
-        <w:t xml:space="preserve">Zeile in «Zuordnung MA» mit Rolle S ergänzen, nach dem Einsatz wieder entfernen.</w:t>
-      </w:r>
-    </w:p>
-    <w:bookmarkEnd w:id="25"/>
-    <w:bookmarkStart w:id="26" w:name="regeln-die-man-sich-merken-muss"/>
+        <w:t xml:space="preserve">Tabellenzeile in «Zuordnung MA» mit Rolle S und Beginn/Ende in D:E ergänzen.</w:t>
+      </w:r>
+      <w:r>
+        <w:t xml:space="preserve"> </w:t>
+      </w:r>
+      <w:r>
+        <w:t xml:space="preserve">Nach dem Einsatz das Ende vervollständigen und die Zeile behalten.</w:t>
+      </w:r>
+    </w:p>
+    <w:bookmarkEnd w:id="31"/>
+    <w:bookmarkStart w:id="32" w:name="regeln-die-man-sich-merken-muss"/>
     <w:p>
       <w:pPr>
         <w:pStyle w:val="Heading3"/>
@@ -2140,264 +3910,9 @@
         <w:t xml:space="preserve">Ein nicht erfasstes Geschwisterkind findet keine Prüfung.</w:t>
       </w:r>
     </w:p>
-    <w:bookmarkEnd w:id="26"/>
-    <w:bookmarkEnd w:id="27"/>
-    <w:bookmarkStart w:id="28" w:name="für-die-umsetzung-in-den-programmen"/>
-    <w:p>
-      <w:pPr>
-        <w:pStyle w:val="Heading2"/>
-      </w:pPr>
-      <w:r>
-        <w:t xml:space="preserve">Für die Umsetzung in den Programmen</w:t>
-      </w:r>
-    </w:p>
-    <w:p>
-      <w:pPr>
-        <w:pStyle w:val="FirstParagraph"/>
-      </w:pPr>
-      <w:r>
-        <w:t xml:space="preserve">Erst nach der Annahme des Modells durch Stephan, vorher bleiben</w:t>
-      </w:r>
-      <w:r>
-        <w:t xml:space="preserve"> </w:t>
-      </w:r>
-      <w:r>
-        <w:rPr>
-          <w:rStyle w:val="VerbatimChar"/>
-        </w:rPr>
-        <w:t xml:space="preserve">src/</w:t>
-      </w:r>
-      <w:r>
-        <w:t xml:space="preserve"> </w:t>
-      </w:r>
-      <w:r>
-        <w:t xml:space="preserve">und die Datenbank unberührt.</w:t>
-      </w:r>
-    </w:p>
-    <w:p>
-      <w:pPr>
-        <w:pStyle w:val="Compact"/>
-        <w:numPr>
-          <w:ilvl w:val="0"/>
-          <w:numId w:val="1008"/>
-        </w:numPr>
-      </w:pPr>
-      <w:r>
-        <w:t xml:space="preserve">Import:</w:t>
-      </w:r>
-      <w:r>
-        <w:t xml:space="preserve"> </w:t>
-      </w:r>
-      <w:r>
-        <w:rPr>
-          <w:rStyle w:val="VerbatimChar"/>
-        </w:rPr>
-        <w:t xml:space="preserve">import-master</w:t>
-      </w:r>
-      <w:r>
-        <w:t xml:space="preserve"> </w:t>
-      </w:r>
-      <w:r>
-        <w:t xml:space="preserve">liest die neuen Blätter (Kinder, Aufträge, Betreuungen,</w:t>
-      </w:r>
-      <w:r>
-        <w:t xml:space="preserve"> </w:t>
-      </w:r>
-      <w:r>
-        <w:t xml:space="preserve">Ansprechpersonen, Zuordnung MA, Berichte) statt der Klientenliste. Die Zuordnung der</w:t>
-      </w:r>
-      <w:r>
-        <w:t xml:space="preserve"> </w:t>
-      </w:r>
-      <w:r>
-        <w:t xml:space="preserve">Blätter zu den Tabellen steht in</w:t>
-      </w:r>
-      <w:r>
-        <w:t xml:space="preserve"> </w:t>
-      </w:r>
-      <w:r>
-        <w:rPr>
-          <w:rStyle w:val="VerbatimChar"/>
-        </w:rPr>
-        <w:t xml:space="preserve">DEFAULT_TABLE_MAPPINGS</w:t>
-      </w:r>
-      <w:r>
-        <w:t xml:space="preserve">.</w:t>
-      </w:r>
-    </w:p>
-    <w:p>
-      <w:pPr>
-        <w:pStyle w:val="Compact"/>
-        <w:numPr>
-          <w:ilvl w:val="0"/>
-          <w:numId w:val="1008"/>
-        </w:numPr>
-      </w:pPr>
-      <w:r>
-        <w:t xml:space="preserve">Rechnung und Zeiterfassung: die Verbindung</w:t>
-      </w:r>
-      <w:r>
-        <w:t xml:space="preserve"> </w:t>
-      </w:r>
-      <w:r>
-        <w:rPr>
-          <w:rStyle w:val="VerbatimChar"/>
-        </w:rPr>
-        <w:t xml:space="preserve">JOIN clients</w:t>
-      </w:r>
-      <w:r>
-        <w:t xml:space="preserve"> </w:t>
-      </w:r>
-      <w:r>
-        <w:t xml:space="preserve">in</w:t>
-      </w:r>
-      <w:r>
-        <w:t xml:space="preserve"> </w:t>
-      </w:r>
-      <w:r>
-        <w:rPr>
-          <w:rStyle w:val="VerbatimChar"/>
-        </w:rPr>
-        <w:t xml:space="preserve">invoice_processor.py</w:t>
-      </w:r>
-      <w:r>
-        <w:t xml:space="preserve"> </w:t>
-      </w:r>
-      <w:r>
-        <w:t xml:space="preserve">und</w:t>
-      </w:r>
-      <w:r>
-        <w:t xml:space="preserve"> </w:t>
-      </w:r>
-      <w:r>
-        <w:rPr>
-          <w:rStyle w:val="VerbatimChar"/>
-        </w:rPr>
-        <w:t xml:space="preserve">client_data.py</w:t>
-      </w:r>
-      <w:r>
-        <w:t xml:space="preserve"> </w:t>
-      </w:r>
-      <w:r>
-        <w:t xml:space="preserve">wird zur Verbindung auf</w:t>
-      </w:r>
-      <w:r>
-        <w:t xml:space="preserve"> </w:t>
-      </w:r>
-      <w:r>
-        <w:rPr>
-          <w:rStyle w:val="VerbatimChar"/>
-        </w:rPr>
-        <w:t xml:space="preserve">mandate</w:t>
-      </w:r>
-      <w:r>
-        <w:t xml:space="preserve">. Die Buchungsdaten bleiben.</w:t>
-      </w:r>
-    </w:p>
-    <w:p>
-      <w:pPr>
-        <w:pStyle w:val="Compact"/>
-        <w:numPr>
-          <w:ilvl w:val="0"/>
-          <w:numId w:val="1008"/>
-        </w:numPr>
-      </w:pPr>
-      <w:r>
-        <w:t xml:space="preserve">Nummern:</w:t>
-      </w:r>
-      <w:r>
-        <w:t xml:space="preserve"> </w:t>
-      </w:r>
-      <w:r>
-        <w:rPr>
-          <w:rStyle w:val="VerbatimChar"/>
-        </w:rPr>
-        <w:t xml:space="preserve">service_data.client_id</w:t>
-      </w:r>
-      <w:r>
-        <w:t xml:space="preserve"> </w:t>
-      </w:r>
-      <w:r>
-        <w:t xml:space="preserve">von</w:t>
-      </w:r>
-      <w:r>
-        <w:t xml:space="preserve"> </w:t>
-      </w:r>
-      <w:r>
-        <w:rPr>
-          <w:rStyle w:val="VerbatimChar"/>
-        </w:rPr>
-        <w:t xml:space="preserve">C…</w:t>
-      </w:r>
-      <w:r>
-        <w:t xml:space="preserve"> </w:t>
-      </w:r>
-      <w:r>
-        <w:t xml:space="preserve">auf die neue Auftragsnummer umstellen. Archivierte</w:t>
-      </w:r>
-      <w:r>
-        <w:t xml:space="preserve"> </w:t>
-      </w:r>
-      <w:r>
-        <w:t xml:space="preserve">Erfassungsbögen tragen die alte Nummer in Zelle G8, dort muss der Import beide Formen kennen.</w:t>
-      </w:r>
-      <w:r>
-        <w:t xml:space="preserve"> </w:t>
-      </w:r>
-      <w:r>
-        <w:t xml:space="preserve">Auch bestehende Rechnungsnummern ändern sich, weil die Rechnungsnummer aus der</w:t>
-      </w:r>
-      <w:r>
-        <w:t xml:space="preserve"> </w:t>
-      </w:r>
-      <w:r>
-        <w:t xml:space="preserve">Auftragsnummer entsteht.</w:t>
-      </w:r>
-    </w:p>
-    <w:p>
-      <w:pPr>
-        <w:pStyle w:val="Compact"/>
-        <w:numPr>
-          <w:ilvl w:val="0"/>
-          <w:numId w:val="1008"/>
-        </w:numPr>
-      </w:pPr>
-      <w:r>
-        <w:t xml:space="preserve">Danach die monatliche Aufgabenliste je Mitarbeitende aus der Berichtsliste. Sie soll am</w:t>
-      </w:r>
-      <w:r>
-        <w:t xml:space="preserve"> </w:t>
-      </w:r>
-      <w:r>
-        <w:t xml:space="preserve">Monatsanfang zusammen mit den Erfassungsbögen entstehen. Ob im selben Lauf oder als eigenes</w:t>
-      </w:r>
-      <w:r>
-        <w:t xml:space="preserve"> </w:t>
-      </w:r>
-      <w:r>
-        <w:t xml:space="preserve">Programm daneben, ist noch zu entscheiden.</w:t>
-      </w:r>
-    </w:p>
-    <w:p>
-      <w:pPr>
-        <w:pStyle w:val="Compact"/>
-        <w:numPr>
-          <w:ilvl w:val="0"/>
-          <w:numId w:val="1008"/>
-        </w:numPr>
-      </w:pPr>
-      <w:r>
-        <w:t xml:space="preserve">Bereinigung der Altdaten nach der Migration der echten Daten. Was die Prüfungen dabei</w:t>
-      </w:r>
-      <w:r>
-        <w:t xml:space="preserve"> </w:t>
-      </w:r>
-      <w:r>
-        <w:t xml:space="preserve">aufdecken, gehört zum Zweck der Übung.</w:t>
-      </w:r>
-    </w:p>
-    <w:bookmarkEnd w:id="28"/>
-    <w:bookmarkEnd w:id="29"/>
+    <w:bookmarkEnd w:id="32"/>
+    <w:bookmarkEnd w:id="33"/>
+    <w:bookmarkEnd w:id="34"/>
     <w:sectPr/>
   </w:body>
 </w:document>
@@ -2851,36 +4366,6 @@
   <w:num w:numId="1007">
     <w:abstractNumId w:val="991"/>
   </w:num>
-  <w:num w:numId="1008">
-    <w:abstractNumId w:val="99411"/>
-    <w:lvlOverride w:ilvl="0">
-      <w:startOverride w:val="1"/>
-    </w:lvlOverride>
-    <w:lvlOverride w:ilvl="1">
-      <w:startOverride w:val="1"/>
-    </w:lvlOverride>
-    <w:lvlOverride w:ilvl="2">
-      <w:startOverride w:val="1"/>
-    </w:lvlOverride>
-    <w:lvlOverride w:ilvl="3">
-      <w:startOverride w:val="1"/>
-    </w:lvlOverride>
-    <w:lvlOverride w:ilvl="4">
-      <w:startOverride w:val="1"/>
-    </w:lvlOverride>
-    <w:lvlOverride w:ilvl="5">
-      <w:startOverride w:val="1"/>
-    </w:lvlOverride>
-    <w:lvlOverride w:ilvl="6">
-      <w:startOverride w:val="1"/>
-    </w:lvlOverride>
-    <w:lvlOverride w:ilvl="7">
-      <w:startOverride w:val="1"/>
-    </w:lvlOverride>
-    <w:lvlOverride w:ilvl="8">
-      <w:startOverride w:val="1"/>
-    </w:lvlOverride>
-  </w:num>
 </w:numbering>
 </file>
 
@@ -3381,7 +4866,7 @@
       <w:color w:themeColor="accent1" w:themeShade="BF" w:val="365F91"/>
     </w:rPr>
   </w:style>
-  <w:style w:type="paragraph" w:customStyle="1" w:styleId="SourceCode">
+  <w:style w:customStyle="1" w:styleId="SourceCode" w:type="paragraph">
     <w:name w:val="Source Code"/>
     <w:basedOn w:val="Normal"/>
     <w:link w:val="VerbatimChar"/>
@@ -3389,7 +4874,7 @@
       <w:wordWrap w:val="off"/>
     </w:pPr>
   </w:style>
-  <w:style w:type="character" w:customStyle="1" w:styleId="KeywordTok">
+  <w:style w:customStyle="1" w:styleId="KeywordTok" w:type="character">
     <w:name w:val="KeywordTok"/>
     <w:basedOn w:val="VerbatimChar"/>
     <w:rPr>
@@ -3397,77 +4882,77 @@
       <w:color w:val="007020"/>
     </w:rPr>
   </w:style>
-  <w:style w:type="character" w:customStyle="1" w:styleId="DataTypeTok">
+  <w:style w:customStyle="1" w:styleId="DataTypeTok" w:type="character">
     <w:name w:val="DataTypeTok"/>
     <w:basedOn w:val="VerbatimChar"/>
     <w:rPr>
       <w:color w:val="902000"/>
     </w:rPr>
   </w:style>
-  <w:style w:type="character" w:customStyle="1" w:styleId="DecValTok">
+  <w:style w:customStyle="1" w:styleId="DecValTok" w:type="character">
     <w:name w:val="DecValTok"/>
     <w:basedOn w:val="VerbatimChar"/>
     <w:rPr>
       <w:color w:val="40a070"/>
     </w:rPr>
   </w:style>
-  <w:style w:type="character" w:customStyle="1" w:styleId="BaseNTok">
+  <w:style w:customStyle="1" w:styleId="BaseNTok" w:type="character">
     <w:name w:val="BaseNTok"/>
     <w:basedOn w:val="VerbatimChar"/>
     <w:rPr>
       <w:color w:val="40a070"/>
     </w:rPr>
   </w:style>
-  <w:style w:type="character" w:customStyle="1" w:styleId="FloatTok">
+  <w:style w:customStyle="1" w:styleId="FloatTok" w:type="character">
     <w:name w:val="FloatTok"/>
     <w:basedOn w:val="VerbatimChar"/>
     <w:rPr>
       <w:color w:val="40a070"/>
     </w:rPr>
   </w:style>
-  <w:style w:type="character" w:customStyle="1" w:styleId="ConstantTok">
+  <w:style w:customStyle="1" w:styleId="ConstantTok" w:type="character">
     <w:name w:val="ConstantTok"/>
     <w:basedOn w:val="VerbatimChar"/>
     <w:rPr>
       <w:color w:val="880000"/>
     </w:rPr>
   </w:style>
-  <w:style w:type="character" w:customStyle="1" w:styleId="CharTok">
+  <w:style w:customStyle="1" w:styleId="CharTok" w:type="character">
     <w:name w:val="CharTok"/>
     <w:basedOn w:val="VerbatimChar"/>
     <w:rPr>
       <w:color w:val="4070a0"/>
     </w:rPr>
   </w:style>
-  <w:style w:type="character" w:customStyle="1" w:styleId="SpecialCharTok">
+  <w:style w:customStyle="1" w:styleId="SpecialCharTok" w:type="character">
     <w:name w:val="SpecialCharTok"/>
     <w:basedOn w:val="VerbatimChar"/>
     <w:rPr>
       <w:color w:val="4070a0"/>
     </w:rPr>
   </w:style>
-  <w:style w:type="character" w:customStyle="1" w:styleId="StringTok">
+  <w:style w:customStyle="1" w:styleId="StringTok" w:type="character">
     <w:name w:val="StringTok"/>
     <w:basedOn w:val="VerbatimChar"/>
     <w:rPr>
       <w:color w:val="4070a0"/>
     </w:rPr>
   </w:style>
-  <w:style w:type="character" w:customStyle="1" w:styleId="VerbatimStringTok">
+  <w:style w:customStyle="1" w:styleId="VerbatimStringTok" w:type="character">
     <w:name w:val="VerbatimStringTok"/>
     <w:basedOn w:val="VerbatimChar"/>
     <w:rPr>
       <w:color w:val="4070a0"/>
     </w:rPr>
   </w:style>
-  <w:style w:type="character" w:customStyle="1" w:styleId="SpecialStringTok">
+  <w:style w:customStyle="1" w:styleId="SpecialStringTok" w:type="character">
     <w:name w:val="SpecialStringTok"/>
     <w:basedOn w:val="VerbatimChar"/>
     <w:rPr>
       <w:color w:val="bb6688"/>
     </w:rPr>
   </w:style>
-  <w:style w:type="character" w:customStyle="1" w:styleId="ImportTok">
+  <w:style w:customStyle="1" w:styleId="ImportTok" w:type="character">
     <w:name w:val="ImportTok"/>
     <w:basedOn w:val="VerbatimChar"/>
     <w:rPr>
@@ -3475,7 +4960,7 @@
       <w:color w:val="008000"/>
     </w:rPr>
   </w:style>
-  <w:style w:type="character" w:customStyle="1" w:styleId="CommentTok">
+  <w:style w:customStyle="1" w:styleId="CommentTok" w:type="character">
     <w:name w:val="CommentTok"/>
     <w:basedOn w:val="VerbatimChar"/>
     <w:rPr>
@@ -3483,7 +4968,7 @@
       <w:color w:val="60a0b0"/>
     </w:rPr>
   </w:style>
-  <w:style w:type="character" w:customStyle="1" w:styleId="DocumentationTok">
+  <w:style w:customStyle="1" w:styleId="DocumentationTok" w:type="character">
     <w:name w:val="DocumentationTok"/>
     <w:basedOn w:val="VerbatimChar"/>
     <w:rPr>
@@ -3491,7 +4976,7 @@
       <w:color w:val="ba2121"/>
     </w:rPr>
   </w:style>
-  <w:style w:type="character" w:customStyle="1" w:styleId="AnnotationTok">
+  <w:style w:customStyle="1" w:styleId="AnnotationTok" w:type="character">
     <w:name w:val="AnnotationTok"/>
     <w:basedOn w:val="VerbatimChar"/>
     <w:rPr>
@@ -3500,7 +4985,7 @@
       <w:color w:val="60a0b0"/>
     </w:rPr>
   </w:style>
-  <w:style w:type="character" w:customStyle="1" w:styleId="CommentVarTok">
+  <w:style w:customStyle="1" w:styleId="CommentVarTok" w:type="character">
     <w:name w:val="CommentVarTok"/>
     <w:basedOn w:val="VerbatimChar"/>
     <w:rPr>
@@ -3509,28 +4994,28 @@
       <w:color w:val="60a0b0"/>
     </w:rPr>
   </w:style>
-  <w:style w:type="character" w:customStyle="1" w:styleId="OtherTok">
+  <w:style w:customStyle="1" w:styleId="OtherTok" w:type="character">
     <w:name w:val="OtherTok"/>
     <w:basedOn w:val="VerbatimChar"/>
     <w:rPr>
       <w:color w:val="007020"/>
     </w:rPr>
   </w:style>
-  <w:style w:type="character" w:customStyle="1" w:styleId="FunctionTok">
+  <w:style w:customStyle="1" w:styleId="FunctionTok" w:type="character">
     <w:name w:val="FunctionTok"/>
     <w:basedOn w:val="VerbatimChar"/>
     <w:rPr>
       <w:color w:val="06287e"/>
     </w:rPr>
   </w:style>
-  <w:style w:type="character" w:customStyle="1" w:styleId="VariableTok">
+  <w:style w:customStyle="1" w:styleId="VariableTok" w:type="character">
     <w:name w:val="VariableTok"/>
     <w:basedOn w:val="VerbatimChar"/>
     <w:rPr>
       <w:color w:val="19177c"/>
     </w:rPr>
   </w:style>
-  <w:style w:type="character" w:customStyle="1" w:styleId="ControlFlowTok">
+  <w:style w:customStyle="1" w:styleId="ControlFlowTok" w:type="character">
     <w:name w:val="ControlFlowTok"/>
     <w:basedOn w:val="VerbatimChar"/>
     <w:rPr>
@@ -3538,45 +5023,45 @@
       <w:color w:val="007020"/>
     </w:rPr>
   </w:style>
-  <w:style w:type="character" w:customStyle="1" w:styleId="OperatorTok">
+  <w:style w:customStyle="1" w:styleId="OperatorTok" w:type="character">
     <w:name w:val="OperatorTok"/>
     <w:basedOn w:val="VerbatimChar"/>
     <w:rPr>
       <w:color w:val="666666"/>
     </w:rPr>
   </w:style>
-  <w:style w:type="character" w:customStyle="1" w:styleId="BuiltInTok">
+  <w:style w:customStyle="1" w:styleId="BuiltInTok" w:type="character">
     <w:name w:val="BuiltInTok"/>
     <w:basedOn w:val="VerbatimChar"/>
     <w:rPr>
       <w:color w:val="008000"/>
     </w:rPr>
   </w:style>
-  <w:style w:type="character" w:customStyle="1" w:styleId="ExtensionTok">
+  <w:style w:customStyle="1" w:styleId="ExtensionTok" w:type="character">
     <w:name w:val="ExtensionTok"/>
     <w:basedOn w:val="VerbatimChar"/>
     <w:rPr/>
   </w:style>
-  <w:style w:type="character" w:customStyle="1" w:styleId="PreprocessorTok">
+  <w:style w:customStyle="1" w:styleId="PreprocessorTok" w:type="character">
     <w:name w:val="PreprocessorTok"/>
     <w:basedOn w:val="VerbatimChar"/>
     <w:rPr>
       <w:color w:val="bc7a00"/>
     </w:rPr>
   </w:style>
-  <w:style w:type="character" w:customStyle="1" w:styleId="AttributeTok">
+  <w:style w:customStyle="1" w:styleId="AttributeTok" w:type="character">
     <w:name w:val="AttributeTok"/>
     <w:basedOn w:val="VerbatimChar"/>
     <w:rPr>
       <w:color w:val="7d9029"/>
     </w:rPr>
   </w:style>
-  <w:style w:type="character" w:customStyle="1" w:styleId="RegionMarkerTok">
+  <w:style w:customStyle="1" w:styleId="RegionMarkerTok" w:type="character">
     <w:name w:val="RegionMarkerTok"/>
     <w:basedOn w:val="VerbatimChar"/>
     <w:rPr/>
   </w:style>
-  <w:style w:type="character" w:customStyle="1" w:styleId="InformationTok">
+  <w:style w:customStyle="1" w:styleId="InformationTok" w:type="character">
     <w:name w:val="InformationTok"/>
     <w:basedOn w:val="VerbatimChar"/>
     <w:rPr>
@@ -3585,7 +5070,7 @@
       <w:color w:val="60a0b0"/>
     </w:rPr>
   </w:style>
-  <w:style w:type="character" w:customStyle="1" w:styleId="WarningTok">
+  <w:style w:customStyle="1" w:styleId="WarningTok" w:type="character">
     <w:name w:val="WarningTok"/>
     <w:basedOn w:val="VerbatimChar"/>
     <w:rPr>
@@ -3594,7 +5079,7 @@
       <w:color w:val="60a0b0"/>
     </w:rPr>
   </w:style>
-  <w:style w:type="character" w:customStyle="1" w:styleId="AlertTok">
+  <w:style w:customStyle="1" w:styleId="AlertTok" w:type="character">
     <w:name w:val="AlertTok"/>
     <w:basedOn w:val="VerbatimChar"/>
     <w:rPr>
@@ -3602,7 +5087,7 @@
       <w:color w:val="ff0000"/>
     </w:rPr>
   </w:style>
-  <w:style w:type="character" w:customStyle="1" w:styleId="ErrorTok">
+  <w:style w:customStyle="1" w:styleId="ErrorTok" w:type="character">
     <w:name w:val="ErrorTok"/>
     <w:basedOn w:val="VerbatimChar"/>
     <w:rPr>
@@ -3610,7 +5095,7 @@
       <w:color w:val="ff0000"/>
     </w:rPr>
   </w:style>
-  <w:style w:type="character" w:customStyle="1" w:styleId="NormalTok">
+  <w:style w:customStyle="1" w:styleId="NormalTok" w:type="character">
     <w:name w:val="NormalTok"/>
     <w:basedOn w:val="VerbatimChar"/>
     <w:rPr/>

</xml_diff>

<commit_message>
Make workbook input formatting consistent and document permanent IDs
</commit_message>
<xml_diff>
--- a/docs/runbook_umstellung_datenmodell.docx
+++ b/docs/runbook_umstellung_datenmodell.docx
@@ -111,7 +111,6 @@
       <w:tr>
         <w:trPr>
           <w:tblHeader w:val="on"/>
-          <w:cantSplit/>
         </w:trPr>
         <w:tc>
           <w:tcPr/>
@@ -139,9 +138,6 @@
         </w:tc>
       </w:tr>
       <w:tr>
-        <w:trPr>
-          <w:cantSplit/>
-        </w:trPr>
         <w:tc>
           <w:tcPr/>
           <w:p>
@@ -168,9 +164,6 @@
         </w:tc>
       </w:tr>
       <w:tr>
-        <w:trPr>
-          <w:cantSplit/>
-        </w:trPr>
         <w:tc>
           <w:tcPr/>
           <w:p>
@@ -197,9 +190,6 @@
         </w:tc>
       </w:tr>
       <w:tr>
-        <w:trPr>
-          <w:cantSplit/>
-        </w:trPr>
         <w:tc>
           <w:tcPr/>
           <w:p>
@@ -226,9 +216,6 @@
         </w:tc>
       </w:tr>
       <w:tr>
-        <w:trPr>
-          <w:cantSplit/>
-        </w:trPr>
         <w:tc>
           <w:tcPr/>
           <w:p>
@@ -255,9 +242,6 @@
         </w:tc>
       </w:tr>
       <w:tr>
-        <w:trPr>
-          <w:cantSplit/>
-        </w:trPr>
         <w:tc>
           <w:tcPr/>
           <w:p>
@@ -284,9 +268,6 @@
         </w:tc>
       </w:tr>
       <w:tr>
-        <w:trPr>
-          <w:cantSplit/>
-        </w:trPr>
         <w:tc>
           <w:tcPr/>
           <w:p>
@@ -313,9 +294,6 @@
         </w:tc>
       </w:tr>
       <w:tr>
-        <w:trPr>
-          <w:cantSplit/>
-        </w:trPr>
         <w:tc>
           <w:tcPr/>
           <w:p>
@@ -376,6 +354,20 @@
       </w:r>
       <w:r>
         <w:t xml:space="preserve">und «Fehlerliste» sind berechnete Ansichten; dort keine Stammdaten eintragen.</w:t>
+      </w:r>
+    </w:p>
+    <w:p>
+      <w:pPr>
+        <w:pStyle w:val="BodyText"/>
+      </w:pPr>
+      <w:r>
+        <w:t xml:space="preserve">Eingabezellen haben keine Füllung, berechnete Anzeigen sind grau hinterlegt.</w:t>
+      </w:r>
+      <w:r>
+        <w:t xml:space="preserve"> </w:t>
+      </w:r>
+      <w:r>
+        <w:t xml:space="preserve">Beide haben einen dünnen Rahmen. Die Kopfzeilen und Warnfarben folgen eigenen Regeln.</w:t>
       </w:r>
     </w:p>
     <w:p>
@@ -402,7 +394,6 @@
       <w:tr>
         <w:trPr>
           <w:tblHeader w:val="on"/>
-          <w:cantSplit/>
         </w:trPr>
         <w:tc>
           <w:tcPr/>
@@ -442,9 +433,6 @@
         </w:tc>
       </w:tr>
       <w:tr>
-        <w:trPr>
-          <w:cantSplit/>
-        </w:trPr>
         <w:tc>
           <w:tcPr/>
           <w:p>
@@ -483,9 +471,6 @@
         </w:tc>
       </w:tr>
       <w:tr>
-        <w:trPr>
-          <w:cantSplit/>
-        </w:trPr>
         <w:tc>
           <w:tcPr/>
           <w:p>
@@ -524,9 +509,6 @@
         </w:tc>
       </w:tr>
       <w:tr>
-        <w:trPr>
-          <w:cantSplit/>
-        </w:trPr>
         <w:tc>
           <w:tcPr/>
           <w:p>
@@ -565,9 +547,6 @@
         </w:tc>
       </w:tr>
       <w:tr>
-        <w:trPr>
-          <w:cantSplit/>
-        </w:trPr>
         <w:tc>
           <w:tcPr/>
           <w:p>
@@ -606,9 +585,6 @@
         </w:tc>
       </w:tr>
       <w:tr>
-        <w:trPr>
-          <w:cantSplit/>
-        </w:trPr>
         <w:tc>
           <w:tcPr/>
           <w:p>
@@ -647,9 +623,6 @@
         </w:tc>
       </w:tr>
       <w:tr>
-        <w:trPr>
-          <w:cantSplit/>
-        </w:trPr>
         <w:tc>
           <w:tcPr/>
           <w:p>
@@ -698,9 +671,6 @@
         </w:tc>
       </w:tr>
       <w:tr>
-        <w:trPr>
-          <w:cantSplit/>
-        </w:trPr>
         <w:tc>
           <w:tcPr/>
           <w:p>
@@ -739,9 +709,6 @@
         </w:tc>
       </w:tr>
       <w:tr>
-        <w:trPr>
-          <w:cantSplit/>
-        </w:trPr>
         <w:tc>
           <w:tcPr/>
           <w:p>
@@ -780,9 +747,6 @@
         </w:tc>
       </w:tr>
       <w:tr>
-        <w:trPr>
-          <w:cantSplit/>
-        </w:trPr>
         <w:tc>
           <w:tcPr/>
           <w:p>
@@ -821,9 +785,6 @@
         </w:tc>
       </w:tr>
       <w:tr>
-        <w:trPr>
-          <w:cantSplit/>
-        </w:trPr>
         <w:tc>
           <w:tcPr/>
           <w:p>
@@ -862,9 +823,6 @@
         </w:tc>
       </w:tr>
       <w:tr>
-        <w:trPr>
-          <w:cantSplit/>
-        </w:trPr>
         <w:tc>
           <w:tcPr/>
           <w:p>
@@ -1210,6 +1168,18 @@
       <w:r>
         <w:t xml:space="preserve">Prüfung-ID und Datensatznummer nennen.</w:t>
       </w:r>
+      <w:r>
+        <w:t xml:space="preserve"> </w:t>
+      </w:r>
+      <w:r>
+        <w:t xml:space="preserve">Die Links in «Prüfungen» F öffnen jeweils die gesamte Fehlerliste, ohne Filter</w:t>
+      </w:r>
+      <w:r>
+        <w:t xml:space="preserve"> </w:t>
+      </w:r>
+      <w:r>
+        <w:t xml:space="preserve">auf die angeklickte Prüfung. H:M ist ein ausgeblendeter technischer Hilfsbereich.</w:t>
+      </w:r>
     </w:p>
     <w:bookmarkStart w:id="25" w:name="X2497901b8aeae3d203bab7ec65776c9f8ffaa1c"/>
     <w:p>
@@ -1256,6 +1226,92 @@
       </w:r>
       <w:r>
         <w:t xml:space="preserve">die bisherige Geschwisterkennung; eine gemeinsame Bezugsperson erzeugt keine Familie.</w:t>
+      </w:r>
+    </w:p>
+    <w:p>
+      <w:pPr>
+        <w:pStyle w:val="BodyText"/>
+      </w:pPr>
+      <w:r>
+        <w:t xml:space="preserve">Für neue Kennungen gilt:</w:t>
+      </w:r>
+      <w:r>
+        <w:t xml:space="preserve"> </w:t>
+      </w:r>
+      <w:r>
+        <w:rPr>
+          <w:b/>
+          <w:bCs/>
+        </w:rPr>
+        <w:t xml:space="preserve">BP0001</w:t>
+      </w:r>
+      <w:r>
+        <w:t xml:space="preserve"> </w:t>
+      </w:r>
+      <w:r>
+        <w:t xml:space="preserve">für Bezugspersonen,</w:t>
+      </w:r>
+      <w:r>
+        <w:t xml:space="preserve"> </w:t>
+      </w:r>
+      <w:r>
+        <w:rPr>
+          <w:b/>
+          <w:bCs/>
+        </w:rPr>
+        <w:t xml:space="preserve">KB0001</w:t>
+      </w:r>
+      <w:r>
+        <w:t xml:space="preserve"> </w:t>
+      </w:r>
+      <w:r>
+        <w:t xml:space="preserve">für</w:t>
+      </w:r>
+      <w:r>
+        <w:t xml:space="preserve"> </w:t>
+      </w:r>
+      <w:r>
+        <w:t xml:space="preserve">Kind-Bezugsperson-Zuordnungen und</w:t>
+      </w:r>
+      <w:r>
+        <w:t xml:space="preserve"> </w:t>
+      </w:r>
+      <w:r>
+        <w:rPr>
+          <w:b/>
+          <w:bCs/>
+        </w:rPr>
+        <w:t xml:space="preserve">PL0001</w:t>
+      </w:r>
+      <w:r>
+        <w:t xml:space="preserve"> </w:t>
+      </w:r>
+      <w:r>
+        <w:t xml:space="preserve">für Platzierungen. Je Liste fortlaufend</w:t>
+      </w:r>
+      <w:r>
+        <w:t xml:space="preserve"> </w:t>
+      </w:r>
+      <w:r>
+        <w:t xml:space="preserve">nummerieren, mindestens vier Ziffern verwenden und Nummern weder ändern noch</w:t>
+      </w:r>
+      <w:r>
+        <w:t xml:space="preserve"> </w:t>
+      </w:r>
+      <w:r>
+        <w:t xml:space="preserve">wiederverwenden. Keine Namen, Rollen oder Jahreszahlen in die Kennung aufnehmen.</w:t>
+      </w:r>
+      <w:r>
+        <w:t xml:space="preserve"> </w:t>
+      </w:r>
+      <w:r>
+        <w:t xml:space="preserve">Dieselbe Bezugsperson behält ihre BP-Nummer bei mehreren Kindern; jede Zuordnung</w:t>
+      </w:r>
+      <w:r>
+        <w:t xml:space="preserve"> </w:t>
+      </w:r>
+      <w:r>
+        <w:t xml:space="preserve">erhält eine eigene KB-Nummer. Bestehende Kennungen bleiben gültig.</w:t>
       </w:r>
     </w:p>
     <w:p>
@@ -1730,7 +1786,6 @@
       <w:tr>
         <w:trPr>
           <w:tblHeader w:val="on"/>
-          <w:cantSplit/>
         </w:trPr>
         <w:tc>
           <w:tcPr/>
@@ -1794,9 +1849,6 @@
         </w:tc>
       </w:tr>
       <w:tr>
-        <w:trPr>
-          <w:cantSplit/>
-        </w:trPr>
         <w:tc>
           <w:tcPr/>
           <w:p>
@@ -1859,9 +1911,6 @@
         </w:tc>
       </w:tr>
       <w:tr>
-        <w:trPr>
-          <w:cantSplit/>
-        </w:trPr>
         <w:tc>
           <w:tcPr/>
           <w:p>
@@ -1916,9 +1965,6 @@
         </w:tc>
       </w:tr>
       <w:tr>
-        <w:trPr>
-          <w:cantSplit/>
-        </w:trPr>
         <w:tc>
           <w:tcPr/>
           <w:p>
@@ -1973,9 +2019,6 @@
         </w:tc>
       </w:tr>
       <w:tr>
-        <w:trPr>
-          <w:cantSplit/>
-        </w:trPr>
         <w:tc>
           <w:tcPr/>
           <w:p>
@@ -2030,9 +2073,6 @@
         </w:tc>
       </w:tr>
       <w:tr>
-        <w:trPr>
-          <w:cantSplit/>
-        </w:trPr>
         <w:tc>
           <w:tcPr/>
           <w:p>
@@ -2083,9 +2123,6 @@
         </w:tc>
       </w:tr>
       <w:tr>
-        <w:trPr>
-          <w:cantSplit/>
-        </w:trPr>
         <w:tc>
           <w:tcPr/>
           <w:p>
@@ -2140,9 +2177,6 @@
         </w:tc>
       </w:tr>
       <w:tr>
-        <w:trPr>
-          <w:cantSplit/>
-        </w:trPr>
         <w:tc>
           <w:tcPr/>
           <w:p>
@@ -2201,9 +2235,6 @@
         </w:tc>
       </w:tr>
       <w:tr>
-        <w:trPr>
-          <w:cantSplit/>
-        </w:trPr>
         <w:tc>
           <w:tcPr/>
           <w:p>
@@ -2266,9 +2297,6 @@
         </w:tc>
       </w:tr>
       <w:tr>
-        <w:trPr>
-          <w:cantSplit/>
-        </w:trPr>
         <w:tc>
           <w:tcPr/>
           <w:p>
@@ -2319,9 +2347,6 @@
         </w:tc>
       </w:tr>
       <w:tr>
-        <w:trPr>
-          <w:cantSplit/>
-        </w:trPr>
         <w:tc>
           <w:tcPr/>
           <w:p>
@@ -2372,9 +2397,6 @@
         </w:tc>
       </w:tr>
       <w:tr>
-        <w:trPr>
-          <w:cantSplit/>
-        </w:trPr>
         <w:tc>
           <w:tcPr/>
           <w:p>
@@ -2425,9 +2447,6 @@
         </w:tc>
       </w:tr>
       <w:tr>
-        <w:trPr>
-          <w:cantSplit/>
-        </w:trPr>
         <w:tc>
           <w:tcPr/>
           <w:p>
@@ -2478,9 +2497,6 @@
         </w:tc>
       </w:tr>
       <w:tr>
-        <w:trPr>
-          <w:cantSplit/>
-        </w:trPr>
         <w:tc>
           <w:tcPr/>
           <w:p>
@@ -2531,9 +2547,6 @@
         </w:tc>
       </w:tr>
       <w:tr>
-        <w:trPr>
-          <w:cantSplit/>
-        </w:trPr>
         <w:tc>
           <w:tcPr/>
           <w:p>

</xml_diff>

<commit_message>
Allow direct check comments and strike through completed checks
</commit_message>
<xml_diff>
--- a/docs/runbook_umstellung_datenmodell.docx
+++ b/docs/runbook_umstellung_datenmodell.docx
@@ -353,7 +353,13 @@
         <w:t xml:space="preserve"> </w:t>
       </w:r>
       <w:r>
-        <w:t xml:space="preserve">und «Fehlerliste» sind berechnete Ansichten; dort keine Stammdaten eintragen.</w:t>
+        <w:t xml:space="preserve">und «Fehlerliste» zeigen berechnete Informationen. In «Prüfungen» ist ausschliesslich</w:t>
+      </w:r>
+      <w:r>
+        <w:t xml:space="preserve"> </w:t>
+      </w:r>
+      <w:r>
+        <w:t xml:space="preserve">G für freie Kommentare vorgesehen; dort keine Stammdaten eintragen.</w:t>
       </w:r>
     </w:p>
     <w:p>
@@ -831,31 +837,31 @@
               <w:jc w:val="left"/>
             </w:pPr>
             <w:r>
-              <w:t xml:space="preserve">Prüfkatalog</w:t>
-            </w:r>
-          </w:p>
-        </w:tc>
-        <w:tc>
-          <w:tcPr/>
-          <w:p>
-            <w:pPr>
-              <w:pStyle w:val="Compact"/>
-              <w:jc w:val="left"/>
-            </w:pPr>
-            <w:r>
-              <w:t xml:space="preserve">G:H (Kommentar/Bearbeitung)</w:t>
-            </w:r>
-          </w:p>
-        </w:tc>
-        <w:tc>
-          <w:tcPr/>
-          <w:p>
-            <w:pPr>
-              <w:pStyle w:val="Compact"/>
-              <w:jc w:val="left"/>
-            </w:pPr>
-            <w:r>
-              <w:t xml:space="preserve">A:F und I:J, fester Katalog und Berechnungen</w:t>
+              <w:t xml:space="preserve">Prüfungen</w:t>
+            </w:r>
+          </w:p>
+        </w:tc>
+        <w:tc>
+          <w:tcPr/>
+          <w:p>
+            <w:pPr>
+              <w:pStyle w:val="Compact"/>
+              <w:jc w:val="left"/>
+            </w:pPr>
+            <w:r>
+              <w:t xml:space="preserve">G (freier Kommentar)</w:t>
+            </w:r>
+          </w:p>
+        </w:tc>
+        <w:tc>
+          <w:tcPr/>
+          <w:p>
+            <w:pPr>
+              <w:pStyle w:val="Compact"/>
+              <w:jc w:val="left"/>
+            </w:pPr>
+            <w:r>
+              <w:t xml:space="preserve">A:F und ausgeblendete technische Spalten</w:t>
             </w:r>
           </w:p>
         </w:tc>
@@ -1126,7 +1132,7 @@
         <w:pStyle w:val="BodyText"/>
       </w:pPr>
       <w:r>
-        <w:t xml:space="preserve">Kommentare werden in der vorbereiteten Kundenkopie im</w:t>
+        <w:t xml:space="preserve">Kommentare direkt in</w:t>
       </w:r>
       <w:r>
         <w:t xml:space="preserve"> </w:t>
@@ -1136,25 +1142,49 @@
           <w:b/>
           <w:bCs/>
         </w:rPr>
-        <w:t xml:space="preserve">Prüfkatalog, Spalte G</w:t>
-      </w:r>
-      <w:r>
-        <w:t xml:space="preserve"> </w:t>
-      </w:r>
-      <w:r>
-        <w:t xml:space="preserve">bei der festen Prüfung-ID gepflegt. Spalte H nimmt Bearbeitungsnotizen auf.</w:t>
-      </w:r>
-      <w:r>
-        <w:t xml:space="preserve"> </w:t>
-      </w:r>
-      <w:r>
-        <w:t xml:space="preserve">«Prüfungen», Spalte G, zeigt den Kommentar automatisch an; dort nicht hineinkopieren.</w:t>
-      </w:r>
-      <w:r>
-        <w:t xml:space="preserve"> </w:t>
-      </w:r>
-      <w:r>
-        <w:t xml:space="preserve">Die sechs bisherigen Kundenkommentare wurden den festen Prüfungen zugeordnet.</w:t>
+        <w:t xml:space="preserve">Prüfungen, Spalte G</w:t>
+      </w:r>
+      <w:r>
+        <w:t xml:space="preserve"> </w:t>
+      </w:r>
+      <w:r>
+        <w:t xml:space="preserve">schreiben. Dies ist die einzige</w:t>
+      </w:r>
+      <w:r>
+        <w:t xml:space="preserve"> </w:t>
+      </w:r>
+      <w:r>
+        <w:t xml:space="preserve">Freitextspalte für Prüfungen. Alle Prüfungen bleiben sichtbar und ihren festen</w:t>
+      </w:r>
+      <w:r>
+        <w:t xml:space="preserve"> </w:t>
+      </w:r>
+      <w:r>
+        <w:t xml:space="preserve">Prüfung-IDs zugeordnet. Bei Anzahl 0 ist die Prüfungszeile grau und durchgestrichen;</w:t>
+      </w:r>
+      <w:r>
+        <w:t xml:space="preserve"> </w:t>
+      </w:r>
+      <w:r>
+        <w:t xml:space="preserve">der Kommentar bleibt normal lesbar und erhalten. Wird die Prüfung wieder offen,</w:t>
+      </w:r>
+      <w:r>
+        <w:t xml:space="preserve"> </w:t>
+      </w:r>
+      <w:r>
+        <w:t xml:space="preserve">erscheint die Zeile wieder normal. Beim Sortieren die gesamte Liste nehmen,</w:t>
+      </w:r>
+      <w:r>
+        <w:t xml:space="preserve"> </w:t>
+      </w:r>
+      <w:r>
+        <w:t xml:space="preserve">niemals eine einzelne Spalte. Der technische Prüfkatalog ist ausgeblendet.</w:t>
+      </w:r>
+      <w:r>
+        <w:t xml:space="preserve"> </w:t>
+      </w:r>
+      <w:r>
+        <w:t xml:space="preserve">Die sechs bisherigen Kundenkommentare bleiben bei ihren Prüfungen.</w:t>
       </w:r>
       <w:r>
         <w:t xml:space="preserve"> </w:t>
@@ -1178,7 +1208,7 @@
         <w:t xml:space="preserve"> </w:t>
       </w:r>
       <w:r>
-        <w:t xml:space="preserve">auf die angeklickte Prüfung. H:M ist ein ausgeblendeter technischer Hilfsbereich.</w:t>
+        <w:t xml:space="preserve">auf die angeklickte Prüfung. Die ausgeblendete Spalte H enthält die feste Prüfung-ID.</w:t>
       </w:r>
     </w:p>
     <w:bookmarkStart w:id="25" w:name="X2497901b8aeae3d203bab7ec65776c9f8ffaa1c"/>

</xml_diff>